<commit_message>
Repositorio renombrado a BD-proyecto-26 (README y manual)
Co-Authored-By: Claude Opus 5.5 <noreply@anthropic.com>
</commit_message>
<xml_diff>
--- a/docs/Manual_HospitalW.docx
+++ b/docs/Manual_HospitalW.docx
@@ -95,7 +95,7 @@
           <w:sz w:val="18"/>
           <w:szCs w:val="18"/>
         </w:rPr>
-        <w:t>Repositorio: BD-proyect-2026 · Versión del 16/10/2026</w:t>
+        <w:t>Repositorio: BD-proyecto-26 · Versión del 16/10/2026</w:t>
       </w:r>
     </w:p>
     <w:p>
@@ -119,7 +119,7 @@
     <w:sdt>
       <w:sdtPr>
         <w:alias w:val="Índice"/>
-        <w:id w:val="-2092608564"/>
+        <w:id w:val="520823785"/>
       </w:sdtPr>
       <w:sdtEndPr/>
       <w:sdtContent>
@@ -142,7 +142,7 @@
           <w:r>
             <w:fldChar w:fldCharType="separate"/>
           </w:r>
-          <w:hyperlink w:anchor="_Toc243030941" w:history="1">
+          <w:hyperlink w:anchor="_Toc243468357" w:history="1">
             <w:r>
               <w:rPr>
                 <w:rStyle w:val="Hipervnculo"/>
@@ -166,7 +166,7 @@
               <w:rPr>
                 <w:noProof/>
               </w:rPr>
-              <w:instrText xml:space="preserve"> PAGEREF _Toc243030941 \h </w:instrText>
+              <w:instrText xml:space="preserve"> PAGEREF _Toc243468357 \h </w:instrText>
             </w:r>
             <w:r>
               <w:rPr>
@@ -203,7 +203,7 @@
               <w:noProof/>
             </w:rPr>
           </w:pPr>
-          <w:hyperlink w:anchor="_Toc243030942" w:history="1">
+          <w:hyperlink w:anchor="_Toc243468358" w:history="1">
             <w:r>
               <w:rPr>
                 <w:rStyle w:val="Hipervnculo"/>
@@ -227,7 +227,7 @@
               <w:rPr>
                 <w:noProof/>
               </w:rPr>
-              <w:instrText xml:space="preserve"> PAGEREF _Toc243030942 \h </w:instrText>
+              <w:instrText xml:space="preserve"> PAGEREF _Toc243468358 \h </w:instrText>
             </w:r>
             <w:r>
               <w:rPr>
@@ -264,7 +264,7 @@
               <w:noProof/>
             </w:rPr>
           </w:pPr>
-          <w:hyperlink w:anchor="_Toc243030943" w:history="1">
+          <w:hyperlink w:anchor="_Toc243468359" w:history="1">
             <w:r>
               <w:rPr>
                 <w:rStyle w:val="Hipervnculo"/>
@@ -288,7 +288,7 @@
               <w:rPr>
                 <w:noProof/>
               </w:rPr>
-              <w:instrText xml:space="preserve"> PAGEREF _Toc243030943 \h </w:instrText>
+              <w:instrText xml:space="preserve"> PAGEREF _Toc243468359 \h </w:instrText>
             </w:r>
             <w:r>
               <w:rPr>
@@ -325,7 +325,7 @@
               <w:noProof/>
             </w:rPr>
           </w:pPr>
-          <w:hyperlink w:anchor="_Toc243030944" w:history="1">
+          <w:hyperlink w:anchor="_Toc243468360" w:history="1">
             <w:r>
               <w:rPr>
                 <w:rStyle w:val="Hipervnculo"/>
@@ -349,7 +349,7 @@
               <w:rPr>
                 <w:noProof/>
               </w:rPr>
-              <w:instrText xml:space="preserve"> PAGEREF _Toc243030944 \h </w:instrText>
+              <w:instrText xml:space="preserve"> PAGEREF _Toc243468360 \h </w:instrText>
             </w:r>
             <w:r>
               <w:rPr>
@@ -386,7 +386,7 @@
               <w:noProof/>
             </w:rPr>
           </w:pPr>
-          <w:hyperlink w:anchor="_Toc243030945" w:history="1">
+          <w:hyperlink w:anchor="_Toc243468361" w:history="1">
             <w:r>
               <w:rPr>
                 <w:rStyle w:val="Hipervnculo"/>
@@ -410,7 +410,7 @@
               <w:rPr>
                 <w:noProof/>
               </w:rPr>
-              <w:instrText xml:space="preserve"> PAGEREF _Toc243030945 \h </w:instrText>
+              <w:instrText xml:space="preserve"> PAGEREF _Toc243468361 \h </w:instrText>
             </w:r>
             <w:r>
               <w:rPr>
@@ -447,7 +447,7 @@
               <w:noProof/>
             </w:rPr>
           </w:pPr>
-          <w:hyperlink w:anchor="_Toc243030946" w:history="1">
+          <w:hyperlink w:anchor="_Toc243468362" w:history="1">
             <w:r>
               <w:rPr>
                 <w:rStyle w:val="Hipervnculo"/>
@@ -471,7 +471,7 @@
               <w:rPr>
                 <w:noProof/>
               </w:rPr>
-              <w:instrText xml:space="preserve"> PAGEREF _Toc243030946 \h </w:instrText>
+              <w:instrText xml:space="preserve"> PAGEREF _Toc243468362 \h </w:instrText>
             </w:r>
             <w:r>
               <w:rPr>
@@ -508,7 +508,7 @@
               <w:noProof/>
             </w:rPr>
           </w:pPr>
-          <w:hyperlink w:anchor="_Toc243030947" w:history="1">
+          <w:hyperlink w:anchor="_Toc243468363" w:history="1">
             <w:r>
               <w:rPr>
                 <w:rStyle w:val="Hipervnculo"/>
@@ -532,7 +532,7 @@
               <w:rPr>
                 <w:noProof/>
               </w:rPr>
-              <w:instrText xml:space="preserve"> PAGEREF _Toc243030947 \h </w:instrText>
+              <w:instrText xml:space="preserve"> PAGEREF _Toc243468363 \h </w:instrText>
             </w:r>
             <w:r>
               <w:rPr>
@@ -569,7 +569,7 @@
               <w:noProof/>
             </w:rPr>
           </w:pPr>
-          <w:hyperlink w:anchor="_Toc243030948" w:history="1">
+          <w:hyperlink w:anchor="_Toc243468364" w:history="1">
             <w:r>
               <w:rPr>
                 <w:rStyle w:val="Hipervnculo"/>
@@ -593,7 +593,7 @@
               <w:rPr>
                 <w:noProof/>
               </w:rPr>
-              <w:instrText xml:space="preserve"> PAGEREF _Toc243030948 \h </w:instrText>
+              <w:instrText xml:space="preserve"> PAGEREF _Toc243468364 \h </w:instrText>
             </w:r>
             <w:r>
               <w:rPr>
@@ -630,7 +630,7 @@
               <w:noProof/>
             </w:rPr>
           </w:pPr>
-          <w:hyperlink w:anchor="_Toc243030949" w:history="1">
+          <w:hyperlink w:anchor="_Toc243468365" w:history="1">
             <w:r>
               <w:rPr>
                 <w:rStyle w:val="Hipervnculo"/>
@@ -654,7 +654,7 @@
               <w:rPr>
                 <w:noProof/>
               </w:rPr>
-              <w:instrText xml:space="preserve"> PAGEREF _Toc243030949 \h </w:instrText>
+              <w:instrText xml:space="preserve"> PAGEREF _Toc243468365 \h </w:instrText>
             </w:r>
             <w:r>
               <w:rPr>
@@ -691,7 +691,7 @@
               <w:noProof/>
             </w:rPr>
           </w:pPr>
-          <w:hyperlink w:anchor="_Toc243030950" w:history="1">
+          <w:hyperlink w:anchor="_Toc243468366" w:history="1">
             <w:r>
               <w:rPr>
                 <w:rStyle w:val="Hipervnculo"/>
@@ -715,7 +715,7 @@
               <w:rPr>
                 <w:noProof/>
               </w:rPr>
-              <w:instrText xml:space="preserve"> PAGEREF _Toc243030950 \h </w:instrText>
+              <w:instrText xml:space="preserve"> PAGEREF _Toc243468366 \h </w:instrText>
             </w:r>
             <w:r>
               <w:rPr>
@@ -752,7 +752,7 @@
               <w:noProof/>
             </w:rPr>
           </w:pPr>
-          <w:hyperlink w:anchor="_Toc243030951" w:history="1">
+          <w:hyperlink w:anchor="_Toc243468367" w:history="1">
             <w:r>
               <w:rPr>
                 <w:rStyle w:val="Hipervnculo"/>
@@ -776,7 +776,7 @@
               <w:rPr>
                 <w:noProof/>
               </w:rPr>
-              <w:instrText xml:space="preserve"> PAGEREF _Toc243030951 \h </w:instrText>
+              <w:instrText xml:space="preserve"> PAGEREF _Toc243468367 \h </w:instrText>
             </w:r>
             <w:r>
               <w:rPr>
@@ -813,7 +813,7 @@
               <w:noProof/>
             </w:rPr>
           </w:pPr>
-          <w:hyperlink w:anchor="_Toc243030952" w:history="1">
+          <w:hyperlink w:anchor="_Toc243468368" w:history="1">
             <w:r>
               <w:rPr>
                 <w:rStyle w:val="Hipervnculo"/>
@@ -837,7 +837,7 @@
               <w:rPr>
                 <w:noProof/>
               </w:rPr>
-              <w:instrText xml:space="preserve"> PAGEREF _Toc243030952 \h </w:instrText>
+              <w:instrText xml:space="preserve"> PAGEREF _Toc243468368 \h </w:instrText>
             </w:r>
             <w:r>
               <w:rPr>
@@ -874,7 +874,7 @@
               <w:noProof/>
             </w:rPr>
           </w:pPr>
-          <w:hyperlink w:anchor="_Toc243030953" w:history="1">
+          <w:hyperlink w:anchor="_Toc243468369" w:history="1">
             <w:r>
               <w:rPr>
                 <w:rStyle w:val="Hipervnculo"/>
@@ -898,7 +898,7 @@
               <w:rPr>
                 <w:noProof/>
               </w:rPr>
-              <w:instrText xml:space="preserve"> PAGEREF _Toc243030953 \h </w:instrText>
+              <w:instrText xml:space="preserve"> PAGEREF _Toc243468369 \h </w:instrText>
             </w:r>
             <w:r>
               <w:rPr>
@@ -935,7 +935,7 @@
               <w:noProof/>
             </w:rPr>
           </w:pPr>
-          <w:hyperlink w:anchor="_Toc243030954" w:history="1">
+          <w:hyperlink w:anchor="_Toc243468370" w:history="1">
             <w:r>
               <w:rPr>
                 <w:rStyle w:val="Hipervnculo"/>
@@ -959,7 +959,7 @@
               <w:rPr>
                 <w:noProof/>
               </w:rPr>
-              <w:instrText xml:space="preserve"> PAGEREF _Toc243030954 \h </w:instrText>
+              <w:instrText xml:space="preserve"> PAGEREF _Toc243468370 \h </w:instrText>
             </w:r>
             <w:r>
               <w:rPr>
@@ -996,7 +996,7 @@
               <w:noProof/>
             </w:rPr>
           </w:pPr>
-          <w:hyperlink w:anchor="_Toc243030955" w:history="1">
+          <w:hyperlink w:anchor="_Toc243468371" w:history="1">
             <w:r>
               <w:rPr>
                 <w:rStyle w:val="Hipervnculo"/>
@@ -1020,7 +1020,7 @@
               <w:rPr>
                 <w:noProof/>
               </w:rPr>
-              <w:instrText xml:space="preserve"> PAGEREF _Toc243030955 \h </w:instrText>
+              <w:instrText xml:space="preserve"> PAGEREF _Toc243468371 \h </w:instrText>
             </w:r>
             <w:r>
               <w:rPr>
@@ -1057,7 +1057,7 @@
               <w:noProof/>
             </w:rPr>
           </w:pPr>
-          <w:hyperlink w:anchor="_Toc243030956" w:history="1">
+          <w:hyperlink w:anchor="_Toc243468372" w:history="1">
             <w:r>
               <w:rPr>
                 <w:rStyle w:val="Hipervnculo"/>
@@ -1081,7 +1081,7 @@
               <w:rPr>
                 <w:noProof/>
               </w:rPr>
-              <w:instrText xml:space="preserve"> PAGEREF _Toc243030956 \h </w:instrText>
+              <w:instrText xml:space="preserve"> PAGEREF _Toc243468372 \h </w:instrText>
             </w:r>
             <w:r>
               <w:rPr>
@@ -1118,7 +1118,7 @@
               <w:noProof/>
             </w:rPr>
           </w:pPr>
-          <w:hyperlink w:anchor="_Toc243030957" w:history="1">
+          <w:hyperlink w:anchor="_Toc243468373" w:history="1">
             <w:r>
               <w:rPr>
                 <w:rStyle w:val="Hipervnculo"/>
@@ -1142,7 +1142,7 @@
               <w:rPr>
                 <w:noProof/>
               </w:rPr>
-              <w:instrText xml:space="preserve"> PAGEREF _Toc243030957 \h </w:instrText>
+              <w:instrText xml:space="preserve"> PAGEREF _Toc243468373 \h </w:instrText>
             </w:r>
             <w:r>
               <w:rPr>
@@ -1179,7 +1179,7 @@
               <w:noProof/>
             </w:rPr>
           </w:pPr>
-          <w:hyperlink w:anchor="_Toc243030958" w:history="1">
+          <w:hyperlink w:anchor="_Toc243468374" w:history="1">
             <w:r>
               <w:rPr>
                 <w:rStyle w:val="Hipervnculo"/>
@@ -1203,7 +1203,7 @@
               <w:rPr>
                 <w:noProof/>
               </w:rPr>
-              <w:instrText xml:space="preserve"> PAGEREF _Toc243030958 \h </w:instrText>
+              <w:instrText xml:space="preserve"> PAGEREF _Toc243468374 \h </w:instrText>
             </w:r>
             <w:r>
               <w:rPr>
@@ -1240,7 +1240,7 @@
               <w:noProof/>
             </w:rPr>
           </w:pPr>
-          <w:hyperlink w:anchor="_Toc243030959" w:history="1">
+          <w:hyperlink w:anchor="_Toc243468375" w:history="1">
             <w:r>
               <w:rPr>
                 <w:rStyle w:val="Hipervnculo"/>
@@ -1264,7 +1264,7 @@
               <w:rPr>
                 <w:noProof/>
               </w:rPr>
-              <w:instrText xml:space="preserve"> PAGEREF _Toc243030959 \h </w:instrText>
+              <w:instrText xml:space="preserve"> PAGEREF _Toc243468375 \h </w:instrText>
             </w:r>
             <w:r>
               <w:rPr>
@@ -1301,7 +1301,7 @@
               <w:noProof/>
             </w:rPr>
           </w:pPr>
-          <w:hyperlink w:anchor="_Toc243030960" w:history="1">
+          <w:hyperlink w:anchor="_Toc243468376" w:history="1">
             <w:r>
               <w:rPr>
                 <w:rStyle w:val="Hipervnculo"/>
@@ -1325,7 +1325,7 @@
               <w:rPr>
                 <w:noProof/>
               </w:rPr>
-              <w:instrText xml:space="preserve"> PAGEREF _Toc243030960 \h </w:instrText>
+              <w:instrText xml:space="preserve"> PAGEREF _Toc243468376 \h </w:instrText>
             </w:r>
             <w:r>
               <w:rPr>
@@ -1362,7 +1362,7 @@
               <w:noProof/>
             </w:rPr>
           </w:pPr>
-          <w:hyperlink w:anchor="_Toc243030961" w:history="1">
+          <w:hyperlink w:anchor="_Toc243468377" w:history="1">
             <w:r>
               <w:rPr>
                 <w:rStyle w:val="Hipervnculo"/>
@@ -1386,7 +1386,7 @@
               <w:rPr>
                 <w:noProof/>
               </w:rPr>
-              <w:instrText xml:space="preserve"> PAGEREF _Toc243030961 \h </w:instrText>
+              <w:instrText xml:space="preserve"> PAGEREF _Toc243468377 \h </w:instrText>
             </w:r>
             <w:r>
               <w:rPr>
@@ -1423,7 +1423,7 @@
               <w:noProof/>
             </w:rPr>
           </w:pPr>
-          <w:hyperlink w:anchor="_Toc243030962" w:history="1">
+          <w:hyperlink w:anchor="_Toc243468378" w:history="1">
             <w:r>
               <w:rPr>
                 <w:rStyle w:val="Hipervnculo"/>
@@ -1447,7 +1447,7 @@
               <w:rPr>
                 <w:noProof/>
               </w:rPr>
-              <w:instrText xml:space="preserve"> PAGEREF _Toc243030962 \h </w:instrText>
+              <w:instrText xml:space="preserve"> PAGEREF _Toc243468378 \h </w:instrText>
             </w:r>
             <w:r>
               <w:rPr>
@@ -1487,7 +1487,7 @@
         <w:keepNext/>
         <w:pageBreakBefore/>
       </w:pPr>
-      <w:bookmarkStart w:id="0" w:name="_Toc243030941"/>
+      <w:bookmarkStart w:id="0" w:name="_Toc243468357"/>
       <w:r>
         <w:lastRenderedPageBreak/>
         <w:t>1. ¿Qué es Hospital W 2.0?</w:t>
@@ -2089,7 +2089,7 @@
         <w:pStyle w:val="Ttulo1"/>
         <w:keepNext/>
       </w:pPr>
-      <w:bookmarkStart w:id="1" w:name="_Toc243030942"/>
+      <w:bookmarkStart w:id="1" w:name="_Toc243468358"/>
       <w:r>
         <w:t>2. Cómo funciona por dentro</w:t>
       </w:r>
@@ -2100,7 +2100,7 @@
         <w:pStyle w:val="Ttulo2"/>
         <w:keepNext/>
       </w:pPr>
-      <w:bookmarkStart w:id="2" w:name="_Toc243030943"/>
+      <w:bookmarkStart w:id="2" w:name="_Toc243468359"/>
       <w:r>
         <w:t>2.1 Las piezas</w:t>
       </w:r>
@@ -2935,7 +2935,7 @@
         <w:pStyle w:val="Ttulo2"/>
         <w:keepNext/>
       </w:pPr>
-      <w:bookmarkStart w:id="3" w:name="_Toc243030944"/>
+      <w:bookmarkStart w:id="3" w:name="_Toc243468360"/>
       <w:r>
         <w:t>2.2 Recorrido de una acción: dar de alta a un empleado</w:t>
       </w:r>
@@ -3099,7 +3099,7 @@
         <w:pStyle w:val="Ttulo2"/>
         <w:keepNext/>
       </w:pPr>
-      <w:bookmarkStart w:id="4" w:name="_Toc243030945"/>
+      <w:bookmarkStart w:id="4" w:name="_Toc243468361"/>
       <w:r>
         <w:t>2.3 La tabla en tiempo real</w:t>
       </w:r>
@@ -3152,7 +3152,7 @@
         <w:pStyle w:val="Ttulo2"/>
         <w:keepNext/>
       </w:pPr>
-      <w:bookmarkStart w:id="5" w:name="_Toc243030946"/>
+      <w:bookmarkStart w:id="5" w:name="_Toc243468362"/>
       <w:r>
         <w:t>2.4 Por qué hay dos caminos hacia la base</w:t>
       </w:r>
@@ -3217,7 +3217,7 @@
         <w:pStyle w:val="Ttulo1"/>
         <w:keepNext/>
       </w:pPr>
-      <w:bookmarkStart w:id="6" w:name="_Toc243030947"/>
+      <w:bookmarkStart w:id="6" w:name="_Toc243468363"/>
       <w:r>
         <w:t>3. Instalación y arranque</w:t>
       </w:r>
@@ -3468,7 +3468,7 @@
         <w:keepNext/>
         <w:pageBreakBefore/>
       </w:pPr>
-      <w:bookmarkStart w:id="7" w:name="_Toc243030948"/>
+      <w:bookmarkStart w:id="7" w:name="_Toc243468364"/>
       <w:r>
         <w:lastRenderedPageBreak/>
         <w:t>4. Manual de uso por pantalla</w:t>
@@ -3480,7 +3480,7 @@
         <w:pStyle w:val="Ttulo2"/>
         <w:keepNext/>
       </w:pPr>
-      <w:bookmarkStart w:id="8" w:name="_Toc243030949"/>
+      <w:bookmarkStart w:id="8" w:name="_Toc243468365"/>
       <w:r>
         <w:t>4.1 Elementos comunes a todas las pantallas</w:t>
       </w:r>
@@ -3969,7 +3969,7 @@
           <w:noProof/>
         </w:rPr>
         <w:drawing>
-          <wp:inline distT="0" distB="0" distL="0" distR="0" wp14:anchorId="4C8B53F5" wp14:editId="4C8B53F6">
+          <wp:inline distT="0" distB="0" distL="0" distR="0" wp14:anchorId="0247B233" wp14:editId="0247B234">
             <wp:extent cx="3810000" cy="1562100"/>
             <wp:effectExtent l="0" t="0" r="0" b="0"/>
             <wp:docPr id="1" name="Imagen 1"/>
@@ -4029,7 +4029,7 @@
         <w:pStyle w:val="Ttulo2"/>
         <w:keepNext/>
       </w:pPr>
-      <w:bookmarkStart w:id="9" w:name="_Toc243030950"/>
+      <w:bookmarkStart w:id="9" w:name="_Toc243468366"/>
       <w:r>
         <w:t>4.2 Panel general</w:t>
       </w:r>
@@ -4055,7 +4055,7 @@
         </w:rPr>
         <w:lastRenderedPageBreak/>
         <w:drawing>
-          <wp:inline distT="0" distB="0" distL="0" distR="0" wp14:anchorId="4C8B53F7" wp14:editId="4C8B53F8">
+          <wp:inline distT="0" distB="0" distL="0" distR="0" wp14:anchorId="0247B235" wp14:editId="0247B236">
             <wp:extent cx="5334000" cy="2371725"/>
             <wp:effectExtent l="0" t="0" r="0" b="0"/>
             <wp:docPr id="2" name="Imagen 2"/>
@@ -4115,7 +4115,7 @@
         <w:pStyle w:val="Ttulo2"/>
         <w:keepNext/>
       </w:pPr>
-      <w:bookmarkStart w:id="10" w:name="_Toc243030951"/>
+      <w:bookmarkStart w:id="10" w:name="_Toc243468367"/>
       <w:r>
         <w:t>4.3 Personal (RF1)</w:t>
       </w:r>
@@ -4132,7 +4132,7 @@
           <w:noProof/>
         </w:rPr>
         <w:drawing>
-          <wp:inline distT="0" distB="0" distL="0" distR="0" wp14:anchorId="4C8B53F9" wp14:editId="4C8B53FA">
+          <wp:inline distT="0" distB="0" distL="0" distR="0" wp14:anchorId="0247B237" wp14:editId="0247B238">
             <wp:extent cx="5334000" cy="2819400"/>
             <wp:effectExtent l="0" t="0" r="0" b="0"/>
             <wp:docPr id="3" name="Imagen 3"/>
@@ -4456,7 +4456,7 @@
           <w:noProof/>
         </w:rPr>
         <w:drawing>
-          <wp:inline distT="0" distB="0" distL="0" distR="0" wp14:anchorId="4C8B53FB" wp14:editId="4C8B53FC">
+          <wp:inline distT="0" distB="0" distL="0" distR="0" wp14:anchorId="0247B239" wp14:editId="0247B23A">
             <wp:extent cx="3810000" cy="2257425"/>
             <wp:effectExtent l="0" t="0" r="0" b="0"/>
             <wp:docPr id="4" name="Imagen 4"/>
@@ -4516,7 +4516,7 @@
         <w:pStyle w:val="Ttulo2"/>
         <w:keepNext/>
       </w:pPr>
-      <w:bookmarkStart w:id="11" w:name="_Toc243030952"/>
+      <w:bookmarkStart w:id="11" w:name="_Toc243468368"/>
       <w:r>
         <w:t>4.4 Admisión de pacientes (RF2)</w:t>
       </w:r>
@@ -4533,7 +4533,7 @@
           <w:noProof/>
         </w:rPr>
         <w:drawing>
-          <wp:inline distT="0" distB="0" distL="0" distR="0" wp14:anchorId="4C8B53FD" wp14:editId="4C8B53FE">
+          <wp:inline distT="0" distB="0" distL="0" distR="0" wp14:anchorId="0247B23B" wp14:editId="0247B23C">
             <wp:extent cx="5334000" cy="2819400"/>
             <wp:effectExtent l="0" t="0" r="0" b="0"/>
             <wp:docPr id="5" name="Imagen 5"/>
@@ -4797,7 +4797,7 @@
         <w:pStyle w:val="Ttulo2"/>
         <w:keepNext/>
       </w:pPr>
-      <w:bookmarkStart w:id="12" w:name="_Toc243030953"/>
+      <w:bookmarkStart w:id="12" w:name="_Toc243468369"/>
       <w:r>
         <w:t>4.5 Hospitalización (RF3)</w:t>
       </w:r>
@@ -4814,7 +4814,7 @@
           <w:noProof/>
         </w:rPr>
         <w:drawing>
-          <wp:inline distT="0" distB="0" distL="0" distR="0" wp14:anchorId="4C8B53FF" wp14:editId="4C8B5400">
+          <wp:inline distT="0" distB="0" distL="0" distR="0" wp14:anchorId="0247B23D" wp14:editId="0247B23E">
             <wp:extent cx="5334000" cy="2819400"/>
             <wp:effectExtent l="0" t="0" r="0" b="0"/>
             <wp:docPr id="6" name="Imagen 6"/>
@@ -5073,7 +5073,7 @@
           <w:noProof/>
         </w:rPr>
         <w:drawing>
-          <wp:inline distT="0" distB="0" distL="0" distR="0" wp14:anchorId="4C8B5401" wp14:editId="4C8B5402">
+          <wp:inline distT="0" distB="0" distL="0" distR="0" wp14:anchorId="0247B23F" wp14:editId="0247B240">
             <wp:extent cx="3810000" cy="1600200"/>
             <wp:effectExtent l="0" t="0" r="0" b="0"/>
             <wp:docPr id="7" name="Imagen 7"/>
@@ -5133,7 +5133,7 @@
         <w:pStyle w:val="Ttulo2"/>
         <w:keepNext/>
       </w:pPr>
-      <w:bookmarkStart w:id="13" w:name="_Toc243030954"/>
+      <w:bookmarkStart w:id="13" w:name="_Toc243468370"/>
       <w:r>
         <w:t>4.6 Inventario (RF4)</w:t>
       </w:r>
@@ -5150,7 +5150,7 @@
           <w:noProof/>
         </w:rPr>
         <w:drawing>
-          <wp:inline distT="0" distB="0" distL="0" distR="0" wp14:anchorId="4C8B5403" wp14:editId="4C8B5404">
+          <wp:inline distT="0" distB="0" distL="0" distR="0" wp14:anchorId="0247B241" wp14:editId="0247B242">
             <wp:extent cx="5334000" cy="2819400"/>
             <wp:effectExtent l="0" t="0" r="0" b="0"/>
             <wp:docPr id="8" name="Imagen 8"/>
@@ -5922,7 +5922,7 @@
           <w:noProof/>
         </w:rPr>
         <w:drawing>
-          <wp:inline distT="0" distB="0" distL="0" distR="0" wp14:anchorId="4C8B5405" wp14:editId="4C8B5406">
+          <wp:inline distT="0" distB="0" distL="0" distR="0" wp14:anchorId="0247B243" wp14:editId="0247B244">
             <wp:extent cx="3810000" cy="3505200"/>
             <wp:effectExtent l="0" t="0" r="0" b="0"/>
             <wp:docPr id="9" name="Imagen 9"/>
@@ -5982,7 +5982,7 @@
         <w:pStyle w:val="Ttulo2"/>
         <w:keepNext/>
       </w:pPr>
-      <w:bookmarkStart w:id="14" w:name="_Toc243030955"/>
+      <w:bookmarkStart w:id="14" w:name="_Toc243468371"/>
       <w:r>
         <w:lastRenderedPageBreak/>
         <w:t>4.7 Telemetría (Big Data)</w:t>
@@ -6000,7 +6000,7 @@
           <w:noProof/>
         </w:rPr>
         <w:drawing>
-          <wp:inline distT="0" distB="0" distL="0" distR="0" wp14:anchorId="4C8B5407" wp14:editId="4C8B5408">
+          <wp:inline distT="0" distB="0" distL="0" distR="0" wp14:anchorId="0247B245" wp14:editId="0247B246">
             <wp:extent cx="5334000" cy="2819400"/>
             <wp:effectExtent l="0" t="0" r="0" b="0"/>
             <wp:docPr id="10" name="Imagen 10"/>
@@ -6559,7 +6559,7 @@
         </w:rPr>
         <w:lastRenderedPageBreak/>
         <w:drawing>
-          <wp:inline distT="0" distB="0" distL="0" distR="0" wp14:anchorId="4C8B5409" wp14:editId="4C8B540A">
+          <wp:inline distT="0" distB="0" distL="0" distR="0" wp14:anchorId="0247B247" wp14:editId="0247B248">
             <wp:extent cx="3810000" cy="1771650"/>
             <wp:effectExtent l="0" t="0" r="0" b="0"/>
             <wp:docPr id="11" name="Imagen 11"/>
@@ -6620,7 +6620,7 @@
         <w:keepNext/>
         <w:pageBreakBefore/>
       </w:pPr>
-      <w:bookmarkStart w:id="15" w:name="_Toc243030956"/>
+      <w:bookmarkStart w:id="15" w:name="_Toc243468372"/>
       <w:r>
         <w:lastRenderedPageBreak/>
         <w:t>5. Funciones principales del código</w:t>
@@ -8045,7 +8045,7 @@
         <w:pStyle w:val="Ttulo1"/>
         <w:keepNext/>
       </w:pPr>
-      <w:bookmarkStart w:id="16" w:name="_Toc243030957"/>
+      <w:bookmarkStart w:id="16" w:name="_Toc243468373"/>
       <w:r>
         <w:lastRenderedPageBreak/>
         <w:t>6. La base de datos</w:t>
@@ -8113,7 +8113,7 @@
         <w:pStyle w:val="Ttulo2"/>
         <w:keepNext/>
       </w:pPr>
-      <w:bookmarkStart w:id="17" w:name="_Toc243030958"/>
+      <w:bookmarkStart w:id="17" w:name="_Toc243468374"/>
       <w:r>
         <w:t>6.1 Tablas principales</w:t>
       </w:r>
@@ -8671,7 +8671,7 @@
         <w:pStyle w:val="Ttulo2"/>
         <w:keepNext/>
       </w:pPr>
-      <w:bookmarkStart w:id="18" w:name="_Toc243030959"/>
+      <w:bookmarkStart w:id="18" w:name="_Toc243468375"/>
       <w:r>
         <w:t>6.2 Queries de la guía</w:t>
       </w:r>
@@ -8939,7 +8939,7 @@
         <w:pStyle w:val="Ttulo2"/>
         <w:keepNext/>
       </w:pPr>
-      <w:bookmarkStart w:id="19" w:name="_Toc243030960"/>
+      <w:bookmarkStart w:id="19" w:name="_Toc243468376"/>
       <w:r>
         <w:t>6.3 Índices</w:t>
       </w:r>
@@ -9015,7 +9015,7 @@
         <w:keepNext/>
         <w:pageBreakBefore/>
       </w:pPr>
-      <w:bookmarkStart w:id="20" w:name="_Toc243030961"/>
+      <w:bookmarkStart w:id="20" w:name="_Toc243468377"/>
       <w:r>
         <w:lastRenderedPageBreak/>
         <w:t>7. Big Data: del sensor al nivel de riesgo</w:t>
@@ -9545,7 +9545,7 @@
           <w:noProof/>
         </w:rPr>
         <w:drawing>
-          <wp:inline distT="0" distB="0" distL="0" distR="0" wp14:anchorId="4C8B540B" wp14:editId="4C8B540C">
+          <wp:inline distT="0" distB="0" distL="0" distR="0" wp14:anchorId="0247B249" wp14:editId="0247B24A">
             <wp:extent cx="3810000" cy="1571625"/>
             <wp:effectExtent l="0" t="0" r="0" b="0"/>
             <wp:docPr id="12" name="Imagen 12"/>
@@ -9646,7 +9646,7 @@
         <w:pStyle w:val="Ttulo1"/>
         <w:keepNext/>
       </w:pPr>
-      <w:bookmarkStart w:id="21" w:name="_Toc243030962"/>
+      <w:bookmarkStart w:id="21" w:name="_Toc243468378"/>
       <w:r>
         <w:lastRenderedPageBreak/>
         <w:t>8. Problemas frecuentes</w:t>
@@ -10289,10 +10289,64 @@
 <file path=word/numbering.xml><?xml version="1.0" encoding="utf-8"?>
 <w:numbering xmlns:wpc="http://schemas.microsoft.com/office/word/2010/wordprocessingCanvas" xmlns:cx="http://schemas.microsoft.com/office/drawing/2014/chartex" xmlns:cx1="http://schemas.microsoft.com/office/drawing/2015/9/8/chartex" xmlns:cx2="http://schemas.microsoft.com/office/drawing/2015/10/21/chartex" xmlns:cx3="http://schemas.microsoft.com/office/drawing/2016/5/9/chartex" xmlns:cx4="http://schemas.microsoft.com/office/drawing/2016/5/10/chartex" xmlns:cx5="http://schemas.microsoft.com/office/drawing/2016/5/11/chartex" xmlns:cx6="http://schemas.microsoft.com/office/drawing/2016/5/12/chartex" xmlns:cx7="http://schemas.microsoft.com/office/drawing/2016/5/13/chartex" xmlns:cx8="http://schemas.microsoft.com/office/drawing/2016/5/14/chartex" xmlns:mc="http://schemas.openxmlformats.org/markup-compatibility/2006" xmlns:aink="http://schemas.microsoft.com/office/drawing/2016/ink" xmlns:am3d="http://schemas.microsoft.com/office/drawing/2017/model3d" xmlns:o="urn:schemas-microsoft-com:office:office" xmlns:oel="http://schemas.microsoft.com/office/2019/extlst" xmlns:r="http://schemas.openxmlformats.org/officeDocument/2006/relationships" xmlns:m="http://schemas.openxmlformats.org/officeDocument/2006/math" xmlns:v="urn:schemas-microsoft-com:vml" xmlns:wp14="http://schemas.microsoft.com/office/word/2010/wordprocessingDrawing" xmlns:wp="http://schemas.openxmlformats.org/drawingml/2006/wordprocessingDrawing" xmlns:w10="urn:schemas-microsoft-com:office:word" xmlns:w="http://schemas.openxmlformats.org/wordprocessingml/2006/main" xmlns:w14="http://schemas.microsoft.com/office/word/2010/wordml" xmlns:w15="http://schemas.microsoft.com/office/word/2012/wordml" xmlns:w16cex="http://schemas.microsoft.com/office/word/2018/wordml/cex" xmlns:w16cid="http://schemas.microsoft.com/office/word/2016/wordml/cid" xmlns:w16="http://schemas.microsoft.com/office/word/2018/wordml" xmlns:w16du="http://schemas.microsoft.com/office/word/2023/wordml/word16du" xmlns:w16sdtdh="http://schemas.microsoft.com/office/word/2020/wordml/sdtdatahash" xmlns:w16sdtfl="http://schemas.microsoft.com/office/word/2024/wordml/sdtformatlock" xmlns:w16se="http://schemas.microsoft.com/office/word/2015/wordml/symex" xmlns:wpg="http://schemas.microsoft.com/office/word/2010/wordprocessingGroup" xmlns:wpi="http://schemas.microsoft.com/office/word/2010/wordprocessingInk" xmlns:wne="http://schemas.microsoft.com/office/word/2006/wordml" xmlns:wps="http://schemas.microsoft.com/office/word/2010/wordprocessingShape" mc:Ignorable="w14 w15 w16se w16cid w16 w16cex w16sdtdh w16sdtfl w16du wp14">
   <w:abstractNum w:abstractNumId="0" w15:restartNumberingAfterBreak="0">
-    <w:nsid w:val="17E2730E"/>
+    <w:nsid w:val="049F0867"/>
     <w:multiLevelType w:val="hybridMultilevel"/>
-    <w:tmpl w:val="75D26300"/>
-    <w:lvl w:ilvl="0" w:tplc="8FD45EA4" w:tentative="1">
+    <w:tmpl w:val="324E6650"/>
+    <w:lvl w:ilvl="0" w:tplc="A2ECE2AE">
+      <w:start w:val="1"/>
+      <w:numFmt w:val="bullet"/>
+      <w:lvlText w:val="•"/>
+      <w:lvlJc w:val="left"/>
+      <w:pPr>
+        <w:ind w:left="540" w:hanging="270"/>
+      </w:pPr>
+    </w:lvl>
+    <w:lvl w:ilvl="1" w:tplc="D4D8EAE0">
+      <w:numFmt w:val="decimal"/>
+      <w:lvlText w:val=""/>
+      <w:lvlJc w:val="left"/>
+    </w:lvl>
+    <w:lvl w:ilvl="2" w:tplc="274CF5EE">
+      <w:numFmt w:val="decimal"/>
+      <w:lvlText w:val=""/>
+      <w:lvlJc w:val="left"/>
+    </w:lvl>
+    <w:lvl w:ilvl="3" w:tplc="3A0C55CE">
+      <w:numFmt w:val="decimal"/>
+      <w:lvlText w:val=""/>
+      <w:lvlJc w:val="left"/>
+    </w:lvl>
+    <w:lvl w:ilvl="4" w:tplc="4DD0A090">
+      <w:numFmt w:val="decimal"/>
+      <w:lvlText w:val=""/>
+      <w:lvlJc w:val="left"/>
+    </w:lvl>
+    <w:lvl w:ilvl="5" w:tplc="442EEAB0">
+      <w:numFmt w:val="decimal"/>
+      <w:lvlText w:val=""/>
+      <w:lvlJc w:val="left"/>
+    </w:lvl>
+    <w:lvl w:ilvl="6" w:tplc="F224E3E4">
+      <w:numFmt w:val="decimal"/>
+      <w:lvlText w:val=""/>
+      <w:lvlJc w:val="left"/>
+    </w:lvl>
+    <w:lvl w:ilvl="7" w:tplc="34482134">
+      <w:numFmt w:val="decimal"/>
+      <w:lvlText w:val=""/>
+      <w:lvlJc w:val="left"/>
+    </w:lvl>
+    <w:lvl w:ilvl="8" w:tplc="114A8880">
+      <w:numFmt w:val="decimal"/>
+      <w:lvlText w:val=""/>
+      <w:lvlJc w:val="left"/>
+    </w:lvl>
+  </w:abstractNum>
+  <w:abstractNum w:abstractNumId="1" w15:restartNumberingAfterBreak="0">
+    <w:nsid w:val="134E3935"/>
+    <w:multiLevelType w:val="hybridMultilevel"/>
+    <w:tmpl w:val="35542290"/>
+    <w:lvl w:ilvl="0" w:tplc="6E6EDC2C" w:tentative="1">
       <w:start w:val="1"/>
       <w:numFmt w:val="bullet"/>
       <w:lvlText w:val="●"/>
@@ -10301,7 +10355,7 @@
         <w:ind w:left="720" w:hanging="360"/>
       </w:pPr>
     </w:lvl>
-    <w:lvl w:ilvl="1" w:tplc="53B237FA" w:tentative="1">
+    <w:lvl w:ilvl="1" w:tplc="35AC560E" w:tentative="1">
       <w:start w:val="1"/>
       <w:numFmt w:val="bullet"/>
       <w:lvlText w:val="○"/>
@@ -10310,7 +10364,7 @@
         <w:ind w:left="1440" w:hanging="360"/>
       </w:pPr>
     </w:lvl>
-    <w:lvl w:ilvl="2" w:tplc="E1EE1422" w:tentative="1">
+    <w:lvl w:ilvl="2" w:tplc="B6D234A4" w:tentative="1">
       <w:start w:val="1"/>
       <w:numFmt w:val="bullet"/>
       <w:lvlText w:val="■"/>
@@ -10319,7 +10373,7 @@
         <w:ind w:left="2160" w:hanging="360"/>
       </w:pPr>
     </w:lvl>
-    <w:lvl w:ilvl="3" w:tplc="BD0C1C8A" w:tentative="1">
+    <w:lvl w:ilvl="3" w:tplc="D8EA1BD6" w:tentative="1">
       <w:start w:val="1"/>
       <w:numFmt w:val="bullet"/>
       <w:lvlText w:val="●"/>
@@ -10328,7 +10382,7 @@
         <w:ind w:left="2880" w:hanging="360"/>
       </w:pPr>
     </w:lvl>
-    <w:lvl w:ilvl="4" w:tplc="455E95BC" w:tentative="1">
+    <w:lvl w:ilvl="4" w:tplc="4FE8D30C" w:tentative="1">
       <w:start w:val="1"/>
       <w:numFmt w:val="bullet"/>
       <w:lvlText w:val="○"/>
@@ -10337,7 +10391,7 @@
         <w:ind w:left="3600" w:hanging="360"/>
       </w:pPr>
     </w:lvl>
-    <w:lvl w:ilvl="5" w:tplc="EACE875C" w:tentative="1">
+    <w:lvl w:ilvl="5" w:tplc="23E0C82A" w:tentative="1">
       <w:start w:val="1"/>
       <w:numFmt w:val="bullet"/>
       <w:lvlText w:val="■"/>
@@ -10346,7 +10400,7 @@
         <w:ind w:left="4320" w:hanging="360"/>
       </w:pPr>
     </w:lvl>
-    <w:lvl w:ilvl="6" w:tplc="5BD43716" w:tentative="1">
+    <w:lvl w:ilvl="6" w:tplc="A2EA7A86" w:tentative="1">
       <w:start w:val="1"/>
       <w:numFmt w:val="bullet"/>
       <w:lvlText w:val="●"/>
@@ -10355,7 +10409,7 @@
         <w:ind w:left="5040" w:hanging="360"/>
       </w:pPr>
     </w:lvl>
-    <w:lvl w:ilvl="7" w:tplc="D6B0BEEC" w:tentative="1">
+    <w:lvl w:ilvl="7" w:tplc="DD3C04CC" w:tentative="1">
       <w:start w:val="1"/>
       <w:numFmt w:val="bullet"/>
       <w:lvlText w:val="●"/>
@@ -10364,7 +10418,7 @@
         <w:ind w:left="5760" w:hanging="360"/>
       </w:pPr>
     </w:lvl>
-    <w:lvl w:ilvl="8" w:tplc="F9469B86" w:tentative="1">
+    <w:lvl w:ilvl="8" w:tplc="7CFC4642" w:tentative="1">
       <w:start w:val="1"/>
       <w:numFmt w:val="bullet"/>
       <w:lvlText w:val="●"/>
@@ -10374,11 +10428,11 @@
       </w:pPr>
     </w:lvl>
   </w:abstractNum>
-  <w:abstractNum w:abstractNumId="1" w15:restartNumberingAfterBreak="0">
-    <w:nsid w:val="69A654FA"/>
+  <w:abstractNum w:abstractNumId="2" w15:restartNumberingAfterBreak="0">
+    <w:nsid w:val="146D5AE8"/>
     <w:multiLevelType w:val="hybridMultilevel"/>
-    <w:tmpl w:val="6B46E322"/>
-    <w:lvl w:ilvl="0" w:tplc="2F60DCCA">
+    <w:tmpl w:val="5F7EC89E"/>
+    <w:lvl w:ilvl="0" w:tplc="F3C67AB2">
       <w:start w:val="1"/>
       <w:numFmt w:val="decimal"/>
       <w:lvlText w:val="%1."/>
@@ -10392,151 +10446,97 @@
         <w:color w:val="0F6E66"/>
       </w:rPr>
     </w:lvl>
-    <w:lvl w:ilvl="1" w:tplc="E1E6F7D4">
+    <w:lvl w:ilvl="1" w:tplc="84A41C98">
       <w:numFmt w:val="decimal"/>
       <w:lvlText w:val=""/>
       <w:lvlJc w:val="left"/>
     </w:lvl>
-    <w:lvl w:ilvl="2" w:tplc="24BE0756">
+    <w:lvl w:ilvl="2" w:tplc="5B4E2EB0">
       <w:numFmt w:val="decimal"/>
       <w:lvlText w:val=""/>
       <w:lvlJc w:val="left"/>
     </w:lvl>
-    <w:lvl w:ilvl="3" w:tplc="EFE606C2">
+    <w:lvl w:ilvl="3" w:tplc="919C968E">
       <w:numFmt w:val="decimal"/>
       <w:lvlText w:val=""/>
       <w:lvlJc w:val="left"/>
     </w:lvl>
-    <w:lvl w:ilvl="4" w:tplc="A62C6F28">
+    <w:lvl w:ilvl="4" w:tplc="49583F0A">
       <w:numFmt w:val="decimal"/>
       <w:lvlText w:val=""/>
       <w:lvlJc w:val="left"/>
     </w:lvl>
-    <w:lvl w:ilvl="5" w:tplc="BFAE09D0">
+    <w:lvl w:ilvl="5" w:tplc="B2145F7A">
       <w:numFmt w:val="decimal"/>
       <w:lvlText w:val=""/>
       <w:lvlJc w:val="left"/>
     </w:lvl>
-    <w:lvl w:ilvl="6" w:tplc="DDD28054">
+    <w:lvl w:ilvl="6" w:tplc="692648FE">
       <w:numFmt w:val="decimal"/>
       <w:lvlText w:val=""/>
       <w:lvlJc w:val="left"/>
     </w:lvl>
-    <w:lvl w:ilvl="7" w:tplc="ACEC6258">
+    <w:lvl w:ilvl="7" w:tplc="A5B6AF6C">
       <w:numFmt w:val="decimal"/>
       <w:lvlText w:val=""/>
       <w:lvlJc w:val="left"/>
     </w:lvl>
-    <w:lvl w:ilvl="8" w:tplc="1FB82224">
+    <w:lvl w:ilvl="8" w:tplc="50761546">
       <w:numFmt w:val="decimal"/>
       <w:lvlText w:val=""/>
       <w:lvlJc w:val="left"/>
     </w:lvl>
   </w:abstractNum>
-  <w:abstractNum w:abstractNumId="2" w15:restartNumberingAfterBreak="0">
-    <w:nsid w:val="754F310A"/>
-    <w:multiLevelType w:val="hybridMultilevel"/>
-    <w:tmpl w:val="2EA865B6"/>
-    <w:lvl w:ilvl="0" w:tplc="61068890">
-      <w:start w:val="1"/>
-      <w:numFmt w:val="bullet"/>
-      <w:lvlText w:val="•"/>
-      <w:lvlJc w:val="left"/>
-      <w:pPr>
-        <w:ind w:left="540" w:hanging="270"/>
-      </w:pPr>
-    </w:lvl>
-    <w:lvl w:ilvl="1" w:tplc="7D26B728">
-      <w:numFmt w:val="decimal"/>
-      <w:lvlText w:val=""/>
-      <w:lvlJc w:val="left"/>
-    </w:lvl>
-    <w:lvl w:ilvl="2" w:tplc="3164385E">
-      <w:numFmt w:val="decimal"/>
-      <w:lvlText w:val=""/>
-      <w:lvlJc w:val="left"/>
-    </w:lvl>
-    <w:lvl w:ilvl="3" w:tplc="B9663732">
-      <w:numFmt w:val="decimal"/>
-      <w:lvlText w:val=""/>
-      <w:lvlJc w:val="left"/>
-    </w:lvl>
-    <w:lvl w:ilvl="4" w:tplc="07280402">
-      <w:numFmt w:val="decimal"/>
-      <w:lvlText w:val=""/>
-      <w:lvlJc w:val="left"/>
-    </w:lvl>
-    <w:lvl w:ilvl="5" w:tplc="009A789C">
-      <w:numFmt w:val="decimal"/>
-      <w:lvlText w:val=""/>
-      <w:lvlJc w:val="left"/>
-    </w:lvl>
-    <w:lvl w:ilvl="6" w:tplc="5C709A38">
-      <w:numFmt w:val="decimal"/>
-      <w:lvlText w:val=""/>
-      <w:lvlJc w:val="left"/>
-    </w:lvl>
-    <w:lvl w:ilvl="7" w:tplc="00A87E72">
-      <w:numFmt w:val="decimal"/>
-      <w:lvlText w:val=""/>
-      <w:lvlJc w:val="left"/>
-    </w:lvl>
-    <w:lvl w:ilvl="8" w:tplc="5046FCCA">
-      <w:numFmt w:val="decimal"/>
-      <w:lvlText w:val=""/>
-      <w:lvlJc w:val="left"/>
-    </w:lvl>
-  </w:abstractNum>
-  <w:num w:numId="1" w16cid:durableId="1339698767">
+  <w:num w:numId="1" w16cid:durableId="1713309352">
+    <w:abstractNumId w:val="1"/>
+    <w:lvlOverride w:ilvl="0">
+      <w:startOverride w:val="1"/>
+    </w:lvlOverride>
+  </w:num>
+  <w:num w:numId="2" w16cid:durableId="1334800235">
+    <w:abstractNumId w:val="2"/>
+    <w:lvlOverride w:ilvl="0">
+      <w:startOverride w:val="1"/>
+    </w:lvlOverride>
+  </w:num>
+  <w:num w:numId="3" w16cid:durableId="872035184">
+    <w:abstractNumId w:val="2"/>
+    <w:lvlOverride w:ilvl="0">
+      <w:startOverride w:val="1"/>
+    </w:lvlOverride>
+  </w:num>
+  <w:num w:numId="4" w16cid:durableId="41946792">
+    <w:abstractNumId w:val="2"/>
+    <w:lvlOverride w:ilvl="0">
+      <w:startOverride w:val="1"/>
+    </w:lvlOverride>
+  </w:num>
+  <w:num w:numId="5" w16cid:durableId="796488958">
+    <w:abstractNumId w:val="2"/>
+    <w:lvlOverride w:ilvl="0">
+      <w:startOverride w:val="1"/>
+    </w:lvlOverride>
+  </w:num>
+  <w:num w:numId="6" w16cid:durableId="836842478">
     <w:abstractNumId w:val="0"/>
     <w:lvlOverride w:ilvl="0">
       <w:startOverride w:val="1"/>
     </w:lvlOverride>
   </w:num>
-  <w:num w:numId="2" w16cid:durableId="893854817">
-    <w:abstractNumId w:val="1"/>
-    <w:lvlOverride w:ilvl="0">
-      <w:startOverride w:val="1"/>
-    </w:lvlOverride>
-  </w:num>
-  <w:num w:numId="3" w16cid:durableId="2065398904">
-    <w:abstractNumId w:val="1"/>
-    <w:lvlOverride w:ilvl="0">
-      <w:startOverride w:val="1"/>
-    </w:lvlOverride>
-  </w:num>
-  <w:num w:numId="4" w16cid:durableId="672417201">
-    <w:abstractNumId w:val="1"/>
-    <w:lvlOverride w:ilvl="0">
-      <w:startOverride w:val="1"/>
-    </w:lvlOverride>
-  </w:num>
-  <w:num w:numId="5" w16cid:durableId="409154092">
-    <w:abstractNumId w:val="1"/>
-    <w:lvlOverride w:ilvl="0">
-      <w:startOverride w:val="1"/>
-    </w:lvlOverride>
-  </w:num>
-  <w:num w:numId="6" w16cid:durableId="1057240045">
+  <w:num w:numId="7" w16cid:durableId="40635130">
     <w:abstractNumId w:val="2"/>
     <w:lvlOverride w:ilvl="0">
       <w:startOverride w:val="1"/>
     </w:lvlOverride>
   </w:num>
-  <w:num w:numId="7" w16cid:durableId="474683588">
-    <w:abstractNumId w:val="1"/>
+  <w:num w:numId="8" w16cid:durableId="1048728505">
+    <w:abstractNumId w:val="2"/>
     <w:lvlOverride w:ilvl="0">
       <w:startOverride w:val="1"/>
     </w:lvlOverride>
   </w:num>
-  <w:num w:numId="8" w16cid:durableId="1608922929">
-    <w:abstractNumId w:val="1"/>
-    <w:lvlOverride w:ilvl="0">
-      <w:startOverride w:val="1"/>
-    </w:lvlOverride>
-  </w:num>
-  <w:num w:numId="9" w16cid:durableId="623737000">
-    <w:abstractNumId w:val="1"/>
+  <w:num w:numId="9" w16cid:durableId="34277826">
+    <w:abstractNumId w:val="2"/>
     <w:lvlOverride w:ilvl="0">
       <w:startOverride w:val="1"/>
     </w:lvlOverride>
@@ -11191,7 +11191,7 @@
     <w:autoRedefine/>
     <w:uiPriority w:val="39"/>
     <w:unhideWhenUsed/>
-    <w:rsid w:val="001E4DF2"/>
+    <w:rsid w:val="00B94053"/>
     <w:pPr>
       <w:spacing w:after="100"/>
     </w:pPr>
@@ -11203,7 +11203,7 @@
     <w:autoRedefine/>
     <w:uiPriority w:val="39"/>
     <w:unhideWhenUsed/>
-    <w:rsid w:val="001E4DF2"/>
+    <w:rsid w:val="00B94053"/>
     <w:pPr>
       <w:spacing w:after="100"/>
       <w:ind w:left="210"/>

</xml_diff>

<commit_message>
Query 3: el porcentaje de stock usa cantidadIdeal en vez de cantidadOrdenada
Se agrega suministroUbicacion.cantidadIdeal (int, > 0): el nivel ideal de
stock de cada insumo en cada almacén. La Query 3 (VW_Stock_Critico) ahora
marca como crítico lo que tenga cantidadDisponible < 15 % de cantidadIdeal.

cantidadOrdenada deja de usarse como "capacidad" y pasa a ser lo que su
nombre indica: el total ordenado/ingresado a esa ubicación, que se acumula
con cada entrada (CHECK >= 0, porque un insumo recién habilitado empieza en 0).

Se actualizan el esquema, la vista, el módulo de inventario, los formularios
(el campo ahora se llama "Cantidad ideal"), los datos de prueba
(sql/03_datos_prueba.sql regenerado desde una base limpia) y el manual.

Co-Authored-By: Claude Opus 5.5 <noreply@anthropic.com>
</commit_message>
<xml_diff>
--- a/docs/Manual_HospitalW.docx
+++ b/docs/Manual_HospitalW.docx
@@ -119,7 +119,7 @@
     <w:sdt>
       <w:sdtPr>
         <w:alias w:val="Índice"/>
-        <w:id w:val="520823785"/>
+        <w:id w:val="306821767"/>
       </w:sdtPr>
       <w:sdtEndPr/>
       <w:sdtContent>
@@ -142,7 +142,7 @@
           <w:r>
             <w:fldChar w:fldCharType="separate"/>
           </w:r>
-          <w:hyperlink w:anchor="_Toc243468357" w:history="1">
+          <w:hyperlink w:anchor="_Toc243559831" w:history="1">
             <w:r>
               <w:rPr>
                 <w:rStyle w:val="Hipervnculo"/>
@@ -166,7 +166,7 @@
               <w:rPr>
                 <w:noProof/>
               </w:rPr>
-              <w:instrText xml:space="preserve"> PAGEREF _Toc243468357 \h </w:instrText>
+              <w:instrText xml:space="preserve"> PAGEREF _Toc243559831 \h </w:instrText>
             </w:r>
             <w:r>
               <w:rPr>
@@ -203,7 +203,7 @@
               <w:noProof/>
             </w:rPr>
           </w:pPr>
-          <w:hyperlink w:anchor="_Toc243468358" w:history="1">
+          <w:hyperlink w:anchor="_Toc243559832" w:history="1">
             <w:r>
               <w:rPr>
                 <w:rStyle w:val="Hipervnculo"/>
@@ -227,7 +227,7 @@
               <w:rPr>
                 <w:noProof/>
               </w:rPr>
-              <w:instrText xml:space="preserve"> PAGEREF _Toc243468358 \h </w:instrText>
+              <w:instrText xml:space="preserve"> PAGEREF _Toc243559832 \h </w:instrText>
             </w:r>
             <w:r>
               <w:rPr>
@@ -264,7 +264,7 @@
               <w:noProof/>
             </w:rPr>
           </w:pPr>
-          <w:hyperlink w:anchor="_Toc243468359" w:history="1">
+          <w:hyperlink w:anchor="_Toc243559833" w:history="1">
             <w:r>
               <w:rPr>
                 <w:rStyle w:val="Hipervnculo"/>
@@ -288,7 +288,7 @@
               <w:rPr>
                 <w:noProof/>
               </w:rPr>
-              <w:instrText xml:space="preserve"> PAGEREF _Toc243468359 \h </w:instrText>
+              <w:instrText xml:space="preserve"> PAGEREF _Toc243559833 \h </w:instrText>
             </w:r>
             <w:r>
               <w:rPr>
@@ -325,7 +325,7 @@
               <w:noProof/>
             </w:rPr>
           </w:pPr>
-          <w:hyperlink w:anchor="_Toc243468360" w:history="1">
+          <w:hyperlink w:anchor="_Toc243559834" w:history="1">
             <w:r>
               <w:rPr>
                 <w:rStyle w:val="Hipervnculo"/>
@@ -349,7 +349,7 @@
               <w:rPr>
                 <w:noProof/>
               </w:rPr>
-              <w:instrText xml:space="preserve"> PAGEREF _Toc243468360 \h </w:instrText>
+              <w:instrText xml:space="preserve"> PAGEREF _Toc243559834 \h </w:instrText>
             </w:r>
             <w:r>
               <w:rPr>
@@ -386,7 +386,7 @@
               <w:noProof/>
             </w:rPr>
           </w:pPr>
-          <w:hyperlink w:anchor="_Toc243468361" w:history="1">
+          <w:hyperlink w:anchor="_Toc243559835" w:history="1">
             <w:r>
               <w:rPr>
                 <w:rStyle w:val="Hipervnculo"/>
@@ -410,7 +410,7 @@
               <w:rPr>
                 <w:noProof/>
               </w:rPr>
-              <w:instrText xml:space="preserve"> PAGEREF _Toc243468361 \h </w:instrText>
+              <w:instrText xml:space="preserve"> PAGEREF _Toc243559835 \h </w:instrText>
             </w:r>
             <w:r>
               <w:rPr>
@@ -447,7 +447,7 @@
               <w:noProof/>
             </w:rPr>
           </w:pPr>
-          <w:hyperlink w:anchor="_Toc243468362" w:history="1">
+          <w:hyperlink w:anchor="_Toc243559836" w:history="1">
             <w:r>
               <w:rPr>
                 <w:rStyle w:val="Hipervnculo"/>
@@ -471,7 +471,7 @@
               <w:rPr>
                 <w:noProof/>
               </w:rPr>
-              <w:instrText xml:space="preserve"> PAGEREF _Toc243468362 \h </w:instrText>
+              <w:instrText xml:space="preserve"> PAGEREF _Toc243559836 \h </w:instrText>
             </w:r>
             <w:r>
               <w:rPr>
@@ -508,7 +508,7 @@
               <w:noProof/>
             </w:rPr>
           </w:pPr>
-          <w:hyperlink w:anchor="_Toc243468363" w:history="1">
+          <w:hyperlink w:anchor="_Toc243559837" w:history="1">
             <w:r>
               <w:rPr>
                 <w:rStyle w:val="Hipervnculo"/>
@@ -532,7 +532,7 @@
               <w:rPr>
                 <w:noProof/>
               </w:rPr>
-              <w:instrText xml:space="preserve"> PAGEREF _Toc243468363 \h </w:instrText>
+              <w:instrText xml:space="preserve"> PAGEREF _Toc243559837 \h </w:instrText>
             </w:r>
             <w:r>
               <w:rPr>
@@ -569,7 +569,7 @@
               <w:noProof/>
             </w:rPr>
           </w:pPr>
-          <w:hyperlink w:anchor="_Toc243468364" w:history="1">
+          <w:hyperlink w:anchor="_Toc243559838" w:history="1">
             <w:r>
               <w:rPr>
                 <w:rStyle w:val="Hipervnculo"/>
@@ -593,7 +593,7 @@
               <w:rPr>
                 <w:noProof/>
               </w:rPr>
-              <w:instrText xml:space="preserve"> PAGEREF _Toc243468364 \h </w:instrText>
+              <w:instrText xml:space="preserve"> PAGEREF _Toc243559838 \h </w:instrText>
             </w:r>
             <w:r>
               <w:rPr>
@@ -630,7 +630,7 @@
               <w:noProof/>
             </w:rPr>
           </w:pPr>
-          <w:hyperlink w:anchor="_Toc243468365" w:history="1">
+          <w:hyperlink w:anchor="_Toc243559839" w:history="1">
             <w:r>
               <w:rPr>
                 <w:rStyle w:val="Hipervnculo"/>
@@ -654,7 +654,7 @@
               <w:rPr>
                 <w:noProof/>
               </w:rPr>
-              <w:instrText xml:space="preserve"> PAGEREF _Toc243468365 \h </w:instrText>
+              <w:instrText xml:space="preserve"> PAGEREF _Toc243559839 \h </w:instrText>
             </w:r>
             <w:r>
               <w:rPr>
@@ -691,7 +691,7 @@
               <w:noProof/>
             </w:rPr>
           </w:pPr>
-          <w:hyperlink w:anchor="_Toc243468366" w:history="1">
+          <w:hyperlink w:anchor="_Toc243559840" w:history="1">
             <w:r>
               <w:rPr>
                 <w:rStyle w:val="Hipervnculo"/>
@@ -715,7 +715,7 @@
               <w:rPr>
                 <w:noProof/>
               </w:rPr>
-              <w:instrText xml:space="preserve"> PAGEREF _Toc243468366 \h </w:instrText>
+              <w:instrText xml:space="preserve"> PAGEREF _Toc243559840 \h </w:instrText>
             </w:r>
             <w:r>
               <w:rPr>
@@ -752,7 +752,7 @@
               <w:noProof/>
             </w:rPr>
           </w:pPr>
-          <w:hyperlink w:anchor="_Toc243468367" w:history="1">
+          <w:hyperlink w:anchor="_Toc243559841" w:history="1">
             <w:r>
               <w:rPr>
                 <w:rStyle w:val="Hipervnculo"/>
@@ -776,7 +776,7 @@
               <w:rPr>
                 <w:noProof/>
               </w:rPr>
-              <w:instrText xml:space="preserve"> PAGEREF _Toc243468367 \h </w:instrText>
+              <w:instrText xml:space="preserve"> PAGEREF _Toc243559841 \h </w:instrText>
             </w:r>
             <w:r>
               <w:rPr>
@@ -813,7 +813,7 @@
               <w:noProof/>
             </w:rPr>
           </w:pPr>
-          <w:hyperlink w:anchor="_Toc243468368" w:history="1">
+          <w:hyperlink w:anchor="_Toc243559842" w:history="1">
             <w:r>
               <w:rPr>
                 <w:rStyle w:val="Hipervnculo"/>
@@ -837,7 +837,7 @@
               <w:rPr>
                 <w:noProof/>
               </w:rPr>
-              <w:instrText xml:space="preserve"> PAGEREF _Toc243468368 \h </w:instrText>
+              <w:instrText xml:space="preserve"> PAGEREF _Toc243559842 \h </w:instrText>
             </w:r>
             <w:r>
               <w:rPr>
@@ -874,7 +874,7 @@
               <w:noProof/>
             </w:rPr>
           </w:pPr>
-          <w:hyperlink w:anchor="_Toc243468369" w:history="1">
+          <w:hyperlink w:anchor="_Toc243559843" w:history="1">
             <w:r>
               <w:rPr>
                 <w:rStyle w:val="Hipervnculo"/>
@@ -898,7 +898,7 @@
               <w:rPr>
                 <w:noProof/>
               </w:rPr>
-              <w:instrText xml:space="preserve"> PAGEREF _Toc243468369 \h </w:instrText>
+              <w:instrText xml:space="preserve"> PAGEREF _Toc243559843 \h </w:instrText>
             </w:r>
             <w:r>
               <w:rPr>
@@ -935,7 +935,7 @@
               <w:noProof/>
             </w:rPr>
           </w:pPr>
-          <w:hyperlink w:anchor="_Toc243468370" w:history="1">
+          <w:hyperlink w:anchor="_Toc243559844" w:history="1">
             <w:r>
               <w:rPr>
                 <w:rStyle w:val="Hipervnculo"/>
@@ -959,7 +959,7 @@
               <w:rPr>
                 <w:noProof/>
               </w:rPr>
-              <w:instrText xml:space="preserve"> PAGEREF _Toc243468370 \h </w:instrText>
+              <w:instrText xml:space="preserve"> PAGEREF _Toc243559844 \h </w:instrText>
             </w:r>
             <w:r>
               <w:rPr>
@@ -996,7 +996,7 @@
               <w:noProof/>
             </w:rPr>
           </w:pPr>
-          <w:hyperlink w:anchor="_Toc243468371" w:history="1">
+          <w:hyperlink w:anchor="_Toc243559845" w:history="1">
             <w:r>
               <w:rPr>
                 <w:rStyle w:val="Hipervnculo"/>
@@ -1020,7 +1020,7 @@
               <w:rPr>
                 <w:noProof/>
               </w:rPr>
-              <w:instrText xml:space="preserve"> PAGEREF _Toc243468371 \h </w:instrText>
+              <w:instrText xml:space="preserve"> PAGEREF _Toc243559845 \h </w:instrText>
             </w:r>
             <w:r>
               <w:rPr>
@@ -1057,7 +1057,7 @@
               <w:noProof/>
             </w:rPr>
           </w:pPr>
-          <w:hyperlink w:anchor="_Toc243468372" w:history="1">
+          <w:hyperlink w:anchor="_Toc243559846" w:history="1">
             <w:r>
               <w:rPr>
                 <w:rStyle w:val="Hipervnculo"/>
@@ -1081,7 +1081,7 @@
               <w:rPr>
                 <w:noProof/>
               </w:rPr>
-              <w:instrText xml:space="preserve"> PAGEREF _Toc243468372 \h </w:instrText>
+              <w:instrText xml:space="preserve"> PAGEREF _Toc243559846 \h </w:instrText>
             </w:r>
             <w:r>
               <w:rPr>
@@ -1118,7 +1118,7 @@
               <w:noProof/>
             </w:rPr>
           </w:pPr>
-          <w:hyperlink w:anchor="_Toc243468373" w:history="1">
+          <w:hyperlink w:anchor="_Toc243559847" w:history="1">
             <w:r>
               <w:rPr>
                 <w:rStyle w:val="Hipervnculo"/>
@@ -1142,7 +1142,7 @@
               <w:rPr>
                 <w:noProof/>
               </w:rPr>
-              <w:instrText xml:space="preserve"> PAGEREF _Toc243468373 \h </w:instrText>
+              <w:instrText xml:space="preserve"> PAGEREF _Toc243559847 \h </w:instrText>
             </w:r>
             <w:r>
               <w:rPr>
@@ -1179,7 +1179,7 @@
               <w:noProof/>
             </w:rPr>
           </w:pPr>
-          <w:hyperlink w:anchor="_Toc243468374" w:history="1">
+          <w:hyperlink w:anchor="_Toc243559848" w:history="1">
             <w:r>
               <w:rPr>
                 <w:rStyle w:val="Hipervnculo"/>
@@ -1203,7 +1203,7 @@
               <w:rPr>
                 <w:noProof/>
               </w:rPr>
-              <w:instrText xml:space="preserve"> PAGEREF _Toc243468374 \h </w:instrText>
+              <w:instrText xml:space="preserve"> PAGEREF _Toc243559848 \h </w:instrText>
             </w:r>
             <w:r>
               <w:rPr>
@@ -1240,7 +1240,7 @@
               <w:noProof/>
             </w:rPr>
           </w:pPr>
-          <w:hyperlink w:anchor="_Toc243468375" w:history="1">
+          <w:hyperlink w:anchor="_Toc243559849" w:history="1">
             <w:r>
               <w:rPr>
                 <w:rStyle w:val="Hipervnculo"/>
@@ -1264,7 +1264,7 @@
               <w:rPr>
                 <w:noProof/>
               </w:rPr>
-              <w:instrText xml:space="preserve"> PAGEREF _Toc243468375 \h </w:instrText>
+              <w:instrText xml:space="preserve"> PAGEREF _Toc243559849 \h </w:instrText>
             </w:r>
             <w:r>
               <w:rPr>
@@ -1301,7 +1301,7 @@
               <w:noProof/>
             </w:rPr>
           </w:pPr>
-          <w:hyperlink w:anchor="_Toc243468376" w:history="1">
+          <w:hyperlink w:anchor="_Toc243559850" w:history="1">
             <w:r>
               <w:rPr>
                 <w:rStyle w:val="Hipervnculo"/>
@@ -1325,7 +1325,7 @@
               <w:rPr>
                 <w:noProof/>
               </w:rPr>
-              <w:instrText xml:space="preserve"> PAGEREF _Toc243468376 \h </w:instrText>
+              <w:instrText xml:space="preserve"> PAGEREF _Toc243559850 \h </w:instrText>
             </w:r>
             <w:r>
               <w:rPr>
@@ -1362,7 +1362,7 @@
               <w:noProof/>
             </w:rPr>
           </w:pPr>
-          <w:hyperlink w:anchor="_Toc243468377" w:history="1">
+          <w:hyperlink w:anchor="_Toc243559851" w:history="1">
             <w:r>
               <w:rPr>
                 <w:rStyle w:val="Hipervnculo"/>
@@ -1386,7 +1386,7 @@
               <w:rPr>
                 <w:noProof/>
               </w:rPr>
-              <w:instrText xml:space="preserve"> PAGEREF _Toc243468377 \h </w:instrText>
+              <w:instrText xml:space="preserve"> PAGEREF _Toc243559851 \h </w:instrText>
             </w:r>
             <w:r>
               <w:rPr>
@@ -1423,7 +1423,7 @@
               <w:noProof/>
             </w:rPr>
           </w:pPr>
-          <w:hyperlink w:anchor="_Toc243468378" w:history="1">
+          <w:hyperlink w:anchor="_Toc243559852" w:history="1">
             <w:r>
               <w:rPr>
                 <w:rStyle w:val="Hipervnculo"/>
@@ -1447,7 +1447,7 @@
               <w:rPr>
                 <w:noProof/>
               </w:rPr>
-              <w:instrText xml:space="preserve"> PAGEREF _Toc243468378 \h </w:instrText>
+              <w:instrText xml:space="preserve"> PAGEREF _Toc243559852 \h </w:instrText>
             </w:r>
             <w:r>
               <w:rPr>
@@ -1487,7 +1487,7 @@
         <w:keepNext/>
         <w:pageBreakBefore/>
       </w:pPr>
-      <w:bookmarkStart w:id="0" w:name="_Toc243468357"/>
+      <w:bookmarkStart w:id="0" w:name="_Toc243559831"/>
       <w:r>
         <w:lastRenderedPageBreak/>
         <w:t>1. ¿Qué es Hospital W 2.0?</w:t>
@@ -2089,7 +2089,7 @@
         <w:pStyle w:val="Ttulo1"/>
         <w:keepNext/>
       </w:pPr>
-      <w:bookmarkStart w:id="1" w:name="_Toc243468358"/>
+      <w:bookmarkStart w:id="1" w:name="_Toc243559832"/>
       <w:r>
         <w:t>2. Cómo funciona por dentro</w:t>
       </w:r>
@@ -2100,7 +2100,7 @@
         <w:pStyle w:val="Ttulo2"/>
         <w:keepNext/>
       </w:pPr>
-      <w:bookmarkStart w:id="2" w:name="_Toc243468359"/>
+      <w:bookmarkStart w:id="2" w:name="_Toc243559833"/>
       <w:r>
         <w:t>2.1 Las piezas</w:t>
       </w:r>
@@ -2935,7 +2935,7 @@
         <w:pStyle w:val="Ttulo2"/>
         <w:keepNext/>
       </w:pPr>
-      <w:bookmarkStart w:id="3" w:name="_Toc243468360"/>
+      <w:bookmarkStart w:id="3" w:name="_Toc243559834"/>
       <w:r>
         <w:t>2.2 Recorrido de una acción: dar de alta a un empleado</w:t>
       </w:r>
@@ -3099,7 +3099,7 @@
         <w:pStyle w:val="Ttulo2"/>
         <w:keepNext/>
       </w:pPr>
-      <w:bookmarkStart w:id="4" w:name="_Toc243468361"/>
+      <w:bookmarkStart w:id="4" w:name="_Toc243559835"/>
       <w:r>
         <w:t>2.3 La tabla en tiempo real</w:t>
       </w:r>
@@ -3152,7 +3152,7 @@
         <w:pStyle w:val="Ttulo2"/>
         <w:keepNext/>
       </w:pPr>
-      <w:bookmarkStart w:id="5" w:name="_Toc243468362"/>
+      <w:bookmarkStart w:id="5" w:name="_Toc243559836"/>
       <w:r>
         <w:t>2.4 Por qué hay dos caminos hacia la base</w:t>
       </w:r>
@@ -3217,7 +3217,7 @@
         <w:pStyle w:val="Ttulo1"/>
         <w:keepNext/>
       </w:pPr>
-      <w:bookmarkStart w:id="6" w:name="_Toc243468363"/>
+      <w:bookmarkStart w:id="6" w:name="_Toc243559837"/>
       <w:r>
         <w:t>3. Instalación y arranque</w:t>
       </w:r>
@@ -3468,7 +3468,7 @@
         <w:keepNext/>
         <w:pageBreakBefore/>
       </w:pPr>
-      <w:bookmarkStart w:id="7" w:name="_Toc243468364"/>
+      <w:bookmarkStart w:id="7" w:name="_Toc243559838"/>
       <w:r>
         <w:lastRenderedPageBreak/>
         <w:t>4. Manual de uso por pantalla</w:t>
@@ -3480,7 +3480,7 @@
         <w:pStyle w:val="Ttulo2"/>
         <w:keepNext/>
       </w:pPr>
-      <w:bookmarkStart w:id="8" w:name="_Toc243468365"/>
+      <w:bookmarkStart w:id="8" w:name="_Toc243559839"/>
       <w:r>
         <w:t>4.1 Elementos comunes a todas las pantallas</w:t>
       </w:r>
@@ -3969,7 +3969,7 @@
           <w:noProof/>
         </w:rPr>
         <w:drawing>
-          <wp:inline distT="0" distB="0" distL="0" distR="0" wp14:anchorId="0247B233" wp14:editId="0247B234">
+          <wp:inline distT="0" distB="0" distL="0" distR="0" wp14:anchorId="74841FBA" wp14:editId="74841FBB">
             <wp:extent cx="3810000" cy="1562100"/>
             <wp:effectExtent l="0" t="0" r="0" b="0"/>
             <wp:docPr id="1" name="Imagen 1"/>
@@ -4029,7 +4029,7 @@
         <w:pStyle w:val="Ttulo2"/>
         <w:keepNext/>
       </w:pPr>
-      <w:bookmarkStart w:id="9" w:name="_Toc243468366"/>
+      <w:bookmarkStart w:id="9" w:name="_Toc243559840"/>
       <w:r>
         <w:t>4.2 Panel general</w:t>
       </w:r>
@@ -4055,7 +4055,7 @@
         </w:rPr>
         <w:lastRenderedPageBreak/>
         <w:drawing>
-          <wp:inline distT="0" distB="0" distL="0" distR="0" wp14:anchorId="0247B235" wp14:editId="0247B236">
+          <wp:inline distT="0" distB="0" distL="0" distR="0" wp14:anchorId="74841FBC" wp14:editId="74841FBD">
             <wp:extent cx="5334000" cy="2371725"/>
             <wp:effectExtent l="0" t="0" r="0" b="0"/>
             <wp:docPr id="2" name="Imagen 2"/>
@@ -4115,7 +4115,7 @@
         <w:pStyle w:val="Ttulo2"/>
         <w:keepNext/>
       </w:pPr>
-      <w:bookmarkStart w:id="10" w:name="_Toc243468367"/>
+      <w:bookmarkStart w:id="10" w:name="_Toc243559841"/>
       <w:r>
         <w:t>4.3 Personal (RF1)</w:t>
       </w:r>
@@ -4132,7 +4132,7 @@
           <w:noProof/>
         </w:rPr>
         <w:drawing>
-          <wp:inline distT="0" distB="0" distL="0" distR="0" wp14:anchorId="0247B237" wp14:editId="0247B238">
+          <wp:inline distT="0" distB="0" distL="0" distR="0" wp14:anchorId="74841FBE" wp14:editId="74841FBF">
             <wp:extent cx="5334000" cy="2819400"/>
             <wp:effectExtent l="0" t="0" r="0" b="0"/>
             <wp:docPr id="3" name="Imagen 3"/>
@@ -4456,7 +4456,7 @@
           <w:noProof/>
         </w:rPr>
         <w:drawing>
-          <wp:inline distT="0" distB="0" distL="0" distR="0" wp14:anchorId="0247B239" wp14:editId="0247B23A">
+          <wp:inline distT="0" distB="0" distL="0" distR="0" wp14:anchorId="74841FC0" wp14:editId="74841FC1">
             <wp:extent cx="3810000" cy="2257425"/>
             <wp:effectExtent l="0" t="0" r="0" b="0"/>
             <wp:docPr id="4" name="Imagen 4"/>
@@ -4516,7 +4516,7 @@
         <w:pStyle w:val="Ttulo2"/>
         <w:keepNext/>
       </w:pPr>
-      <w:bookmarkStart w:id="11" w:name="_Toc243468368"/>
+      <w:bookmarkStart w:id="11" w:name="_Toc243559842"/>
       <w:r>
         <w:t>4.4 Admisión de pacientes (RF2)</w:t>
       </w:r>
@@ -4533,7 +4533,7 @@
           <w:noProof/>
         </w:rPr>
         <w:drawing>
-          <wp:inline distT="0" distB="0" distL="0" distR="0" wp14:anchorId="0247B23B" wp14:editId="0247B23C">
+          <wp:inline distT="0" distB="0" distL="0" distR="0" wp14:anchorId="74841FC2" wp14:editId="74841FC3">
             <wp:extent cx="5334000" cy="2819400"/>
             <wp:effectExtent l="0" t="0" r="0" b="0"/>
             <wp:docPr id="5" name="Imagen 5"/>
@@ -4797,7 +4797,7 @@
         <w:pStyle w:val="Ttulo2"/>
         <w:keepNext/>
       </w:pPr>
-      <w:bookmarkStart w:id="12" w:name="_Toc243468369"/>
+      <w:bookmarkStart w:id="12" w:name="_Toc243559843"/>
       <w:r>
         <w:t>4.5 Hospitalización (RF3)</w:t>
       </w:r>
@@ -4814,7 +4814,7 @@
           <w:noProof/>
         </w:rPr>
         <w:drawing>
-          <wp:inline distT="0" distB="0" distL="0" distR="0" wp14:anchorId="0247B23D" wp14:editId="0247B23E">
+          <wp:inline distT="0" distB="0" distL="0" distR="0" wp14:anchorId="74841FC4" wp14:editId="74841FC5">
             <wp:extent cx="5334000" cy="2819400"/>
             <wp:effectExtent l="0" t="0" r="0" b="0"/>
             <wp:docPr id="6" name="Imagen 6"/>
@@ -5073,7 +5073,7 @@
           <w:noProof/>
         </w:rPr>
         <w:drawing>
-          <wp:inline distT="0" distB="0" distL="0" distR="0" wp14:anchorId="0247B23F" wp14:editId="0247B240">
+          <wp:inline distT="0" distB="0" distL="0" distR="0" wp14:anchorId="74841FC6" wp14:editId="74841FC7">
             <wp:extent cx="3810000" cy="1600200"/>
             <wp:effectExtent l="0" t="0" r="0" b="0"/>
             <wp:docPr id="7" name="Imagen 7"/>
@@ -5133,7 +5133,7 @@
         <w:pStyle w:val="Ttulo2"/>
         <w:keepNext/>
       </w:pPr>
-      <w:bookmarkStart w:id="13" w:name="_Toc243468370"/>
+      <w:bookmarkStart w:id="13" w:name="_Toc243559844"/>
       <w:r>
         <w:t>4.6 Inventario (RF4)</w:t>
       </w:r>
@@ -5150,7 +5150,7 @@
           <w:noProof/>
         </w:rPr>
         <w:drawing>
-          <wp:inline distT="0" distB="0" distL="0" distR="0" wp14:anchorId="0247B241" wp14:editId="0247B242">
+          <wp:inline distT="0" distB="0" distL="0" distR="0" wp14:anchorId="74841FC8" wp14:editId="74841FC9">
             <wp:extent cx="5334000" cy="2819400"/>
             <wp:effectExtent l="0" t="0" r="0" b="0"/>
             <wp:docPr id="8" name="Imagen 8"/>
@@ -5402,7 +5402,23 @@
                 <w:sz w:val="19"/>
                 <w:szCs w:val="19"/>
               </w:rPr>
-              <w:t xml:space="preserve"> (obligatorio), ubicación, stock inicial y capacidad normal.</w:t>
+              <w:t xml:space="preserve"> (obligatorio), ubicación, stock inicial y </w:t>
+            </w:r>
+            <w:r>
+              <w:rPr>
+                <w:b/>
+                <w:bCs/>
+                <w:sz w:val="19"/>
+                <w:szCs w:val="19"/>
+              </w:rPr>
+              <w:t>cantidad ideal</w:t>
+            </w:r>
+            <w:r>
+              <w:rPr>
+                <w:sz w:val="19"/>
+                <w:szCs w:val="19"/>
+              </w:rPr>
+              <w:t>.</w:t>
             </w:r>
           </w:p>
         </w:tc>
@@ -5553,7 +5569,7 @@
                 <w:sz w:val="19"/>
                 <w:szCs w:val="19"/>
               </w:rPr>
-              <w:t>Si el insumo llega por primera vez a ese almacén, pide su capacidad normal.</w:t>
+              <w:t>Si el insumo llega por primera vez a ese almacén, pide su cantidad ideal.</w:t>
             </w:r>
           </w:p>
         </w:tc>
@@ -5888,7 +5904,29 @@
         <w:t>Query 3</w:t>
       </w:r>
       <w:r>
-        <w:t xml:space="preserve">: lista los insumos con menos del 15 % de su capacidad normal, con el contacto del proveedor para reabastecer. La pestaña </w:t>
+        <w:t xml:space="preserve">: lista los insumos con menos del 15 % de su </w:t>
+      </w:r>
+      <w:r>
+        <w:rPr>
+          <w:b/>
+          <w:bCs/>
+        </w:rPr>
+        <w:t>cantidad ideal</w:t>
+      </w:r>
+      <w:r>
+        <w:t xml:space="preserve"> (</w:t>
+      </w:r>
+      <w:r>
+        <w:rPr>
+          <w:rFonts w:ascii="Consolas" w:eastAsia="Consolas" w:hAnsi="Consolas" w:cs="Consolas"/>
+          <w:color w:val="0F6E66"/>
+          <w:sz w:val="19"/>
+          <w:szCs w:val="19"/>
+        </w:rPr>
+        <w:t>cantidadDisponible / cantidadIdeal</w:t>
+      </w:r>
+      <w:r>
+        <w:t xml:space="preserve">), con el contacto del proveedor para reabastecer. La pestaña </w:t>
       </w:r>
       <w:r>
         <w:rPr>
@@ -5922,7 +5960,7 @@
           <w:noProof/>
         </w:rPr>
         <w:drawing>
-          <wp:inline distT="0" distB="0" distL="0" distR="0" wp14:anchorId="0247B243" wp14:editId="0247B244">
+          <wp:inline distT="0" distB="0" distL="0" distR="0" wp14:anchorId="74841FCA" wp14:editId="74841FCB">
             <wp:extent cx="3810000" cy="3505200"/>
             <wp:effectExtent l="0" t="0" r="0" b="0"/>
             <wp:docPr id="9" name="Imagen 9"/>
@@ -5982,7 +6020,7 @@
         <w:pStyle w:val="Ttulo2"/>
         <w:keepNext/>
       </w:pPr>
-      <w:bookmarkStart w:id="14" w:name="_Toc243468371"/>
+      <w:bookmarkStart w:id="14" w:name="_Toc243559845"/>
       <w:r>
         <w:lastRenderedPageBreak/>
         <w:t>4.7 Telemetría (Big Data)</w:t>
@@ -6000,7 +6038,7 @@
           <w:noProof/>
         </w:rPr>
         <w:drawing>
-          <wp:inline distT="0" distB="0" distL="0" distR="0" wp14:anchorId="0247B245" wp14:editId="0247B246">
+          <wp:inline distT="0" distB="0" distL="0" distR="0" wp14:anchorId="74841FCC" wp14:editId="74841FCD">
             <wp:extent cx="5334000" cy="2819400"/>
             <wp:effectExtent l="0" t="0" r="0" b="0"/>
             <wp:docPr id="10" name="Imagen 10"/>
@@ -6559,7 +6597,7 @@
         </w:rPr>
         <w:lastRenderedPageBreak/>
         <w:drawing>
-          <wp:inline distT="0" distB="0" distL="0" distR="0" wp14:anchorId="0247B247" wp14:editId="0247B248">
+          <wp:inline distT="0" distB="0" distL="0" distR="0" wp14:anchorId="74841FCE" wp14:editId="74841FCF">
             <wp:extent cx="3810000" cy="1771650"/>
             <wp:effectExtent l="0" t="0" r="0" b="0"/>
             <wp:docPr id="11" name="Imagen 11"/>
@@ -6620,7 +6658,7 @@
         <w:keepNext/>
         <w:pageBreakBefore/>
       </w:pPr>
-      <w:bookmarkStart w:id="15" w:name="_Toc243468372"/>
+      <w:bookmarkStart w:id="15" w:name="_Toc243559846"/>
       <w:r>
         <w:lastRenderedPageBreak/>
         <w:t>5. Funciones principales del código</w:t>
@@ -8045,7 +8083,7 @@
         <w:pStyle w:val="Ttulo1"/>
         <w:keepNext/>
       </w:pPr>
-      <w:bookmarkStart w:id="16" w:name="_Toc243468373"/>
+      <w:bookmarkStart w:id="16" w:name="_Toc243559847"/>
       <w:r>
         <w:lastRenderedPageBreak/>
         <w:t>6. La base de datos</w:t>
@@ -8113,7 +8151,7 @@
         <w:pStyle w:val="Ttulo2"/>
         <w:keepNext/>
       </w:pPr>
-      <w:bookmarkStart w:id="17" w:name="_Toc243468374"/>
+      <w:bookmarkStart w:id="17" w:name="_Toc243559848"/>
       <w:r>
         <w:t>6.1 Tablas principales</w:t>
       </w:r>
@@ -8604,7 +8642,55 @@
                 <w:sz w:val="19"/>
                 <w:szCs w:val="19"/>
               </w:rPr>
-              <w:t>Capacidad normal y stock actual de cada insumo en cada almacén.</w:t>
+              <w:t>Total ordenado (</w:t>
+            </w:r>
+            <w:r>
+              <w:rPr>
+                <w:rFonts w:ascii="Consolas" w:eastAsia="Consolas" w:hAnsi="Consolas" w:cs="Consolas"/>
+                <w:color w:val="0F6E66"/>
+                <w:sz w:val="19"/>
+                <w:szCs w:val="19"/>
+              </w:rPr>
+              <w:t>cantidadOrdenada</w:t>
+            </w:r>
+            <w:r>
+              <w:rPr>
+                <w:sz w:val="19"/>
+                <w:szCs w:val="19"/>
+              </w:rPr>
+              <w:t>), stock actual (</w:t>
+            </w:r>
+            <w:r>
+              <w:rPr>
+                <w:rFonts w:ascii="Consolas" w:eastAsia="Consolas" w:hAnsi="Consolas" w:cs="Consolas"/>
+                <w:color w:val="0F6E66"/>
+                <w:sz w:val="19"/>
+                <w:szCs w:val="19"/>
+              </w:rPr>
+              <w:t>cantidadDisponible</w:t>
+            </w:r>
+            <w:r>
+              <w:rPr>
+                <w:sz w:val="19"/>
+                <w:szCs w:val="19"/>
+              </w:rPr>
+              <w:t>) y nivel ideal (</w:t>
+            </w:r>
+            <w:r>
+              <w:rPr>
+                <w:rFonts w:ascii="Consolas" w:eastAsia="Consolas" w:hAnsi="Consolas" w:cs="Consolas"/>
+                <w:color w:val="0F6E66"/>
+                <w:sz w:val="19"/>
+                <w:szCs w:val="19"/>
+              </w:rPr>
+              <w:t>cantidadIdeal</w:t>
+            </w:r>
+            <w:r>
+              <w:rPr>
+                <w:sz w:val="19"/>
+                <w:szCs w:val="19"/>
+              </w:rPr>
+              <w:t>) de cada insumo en cada almacén.</w:t>
             </w:r>
           </w:p>
         </w:tc>
@@ -8671,7 +8757,7 @@
         <w:pStyle w:val="Ttulo2"/>
         <w:keepNext/>
       </w:pPr>
-      <w:bookmarkStart w:id="18" w:name="_Toc243468375"/>
+      <w:bookmarkStart w:id="18" w:name="_Toc243559849"/>
       <w:r>
         <w:t>6.2 Queries de la guía</w:t>
       </w:r>
@@ -8939,7 +9025,7 @@
         <w:pStyle w:val="Ttulo2"/>
         <w:keepNext/>
       </w:pPr>
-      <w:bookmarkStart w:id="19" w:name="_Toc243468376"/>
+      <w:bookmarkStart w:id="19" w:name="_Toc243559850"/>
       <w:r>
         <w:t>6.3 Índices</w:t>
       </w:r>
@@ -9015,7 +9101,7 @@
         <w:keepNext/>
         <w:pageBreakBefore/>
       </w:pPr>
-      <w:bookmarkStart w:id="20" w:name="_Toc243468377"/>
+      <w:bookmarkStart w:id="20" w:name="_Toc243559851"/>
       <w:r>
         <w:lastRenderedPageBreak/>
         <w:t>7. Big Data: del sensor al nivel de riesgo</w:t>
@@ -9545,7 +9631,7 @@
           <w:noProof/>
         </w:rPr>
         <w:drawing>
-          <wp:inline distT="0" distB="0" distL="0" distR="0" wp14:anchorId="0247B249" wp14:editId="0247B24A">
+          <wp:inline distT="0" distB="0" distL="0" distR="0" wp14:anchorId="74841FD0" wp14:editId="74841FD1">
             <wp:extent cx="3810000" cy="1571625"/>
             <wp:effectExtent l="0" t="0" r="0" b="0"/>
             <wp:docPr id="12" name="Imagen 12"/>
@@ -9646,7 +9732,7 @@
         <w:pStyle w:val="Ttulo1"/>
         <w:keepNext/>
       </w:pPr>
-      <w:bookmarkStart w:id="21" w:name="_Toc243468378"/>
+      <w:bookmarkStart w:id="21" w:name="_Toc243559852"/>
       <w:r>
         <w:lastRenderedPageBreak/>
         <w:t>8. Problemas frecuentes</w:t>
@@ -10289,10 +10375,96 @@
 <file path=word/numbering.xml><?xml version="1.0" encoding="utf-8"?>
 <w:numbering xmlns:wpc="http://schemas.microsoft.com/office/word/2010/wordprocessingCanvas" xmlns:cx="http://schemas.microsoft.com/office/drawing/2014/chartex" xmlns:cx1="http://schemas.microsoft.com/office/drawing/2015/9/8/chartex" xmlns:cx2="http://schemas.microsoft.com/office/drawing/2015/10/21/chartex" xmlns:cx3="http://schemas.microsoft.com/office/drawing/2016/5/9/chartex" xmlns:cx4="http://schemas.microsoft.com/office/drawing/2016/5/10/chartex" xmlns:cx5="http://schemas.microsoft.com/office/drawing/2016/5/11/chartex" xmlns:cx6="http://schemas.microsoft.com/office/drawing/2016/5/12/chartex" xmlns:cx7="http://schemas.microsoft.com/office/drawing/2016/5/13/chartex" xmlns:cx8="http://schemas.microsoft.com/office/drawing/2016/5/14/chartex" xmlns:mc="http://schemas.openxmlformats.org/markup-compatibility/2006" xmlns:aink="http://schemas.microsoft.com/office/drawing/2016/ink" xmlns:am3d="http://schemas.microsoft.com/office/drawing/2017/model3d" xmlns:o="urn:schemas-microsoft-com:office:office" xmlns:oel="http://schemas.microsoft.com/office/2019/extlst" xmlns:r="http://schemas.openxmlformats.org/officeDocument/2006/relationships" xmlns:m="http://schemas.openxmlformats.org/officeDocument/2006/math" xmlns:v="urn:schemas-microsoft-com:vml" xmlns:wp14="http://schemas.microsoft.com/office/word/2010/wordprocessingDrawing" xmlns:wp="http://schemas.openxmlformats.org/drawingml/2006/wordprocessingDrawing" xmlns:w10="urn:schemas-microsoft-com:office:word" xmlns:w="http://schemas.openxmlformats.org/wordprocessingml/2006/main" xmlns:w14="http://schemas.microsoft.com/office/word/2010/wordml" xmlns:w15="http://schemas.microsoft.com/office/word/2012/wordml" xmlns:w16cex="http://schemas.microsoft.com/office/word/2018/wordml/cex" xmlns:w16cid="http://schemas.microsoft.com/office/word/2016/wordml/cid" xmlns:w16="http://schemas.microsoft.com/office/word/2018/wordml" xmlns:w16du="http://schemas.microsoft.com/office/word/2023/wordml/word16du" xmlns:w16sdtdh="http://schemas.microsoft.com/office/word/2020/wordml/sdtdatahash" xmlns:w16sdtfl="http://schemas.microsoft.com/office/word/2024/wordml/sdtformatlock" xmlns:w16se="http://schemas.microsoft.com/office/word/2015/wordml/symex" xmlns:wpg="http://schemas.microsoft.com/office/word/2010/wordprocessingGroup" xmlns:wpi="http://schemas.microsoft.com/office/word/2010/wordprocessingInk" xmlns:wne="http://schemas.microsoft.com/office/word/2006/wordml" xmlns:wps="http://schemas.microsoft.com/office/word/2010/wordprocessingShape" mc:Ignorable="w14 w15 w16se w16cid w16 w16cex w16sdtdh w16sdtfl w16du wp14">
   <w:abstractNum w:abstractNumId="0" w15:restartNumberingAfterBreak="0">
-    <w:nsid w:val="049F0867"/>
+    <w:nsid w:val="0B846B78"/>
     <w:multiLevelType w:val="hybridMultilevel"/>
-    <w:tmpl w:val="324E6650"/>
-    <w:lvl w:ilvl="0" w:tplc="A2ECE2AE">
+    <w:tmpl w:val="3BA0B148"/>
+    <w:lvl w:ilvl="0" w:tplc="AF6A0244" w:tentative="1">
+      <w:start w:val="1"/>
+      <w:numFmt w:val="bullet"/>
+      <w:lvlText w:val="●"/>
+      <w:lvlJc w:val="left"/>
+      <w:pPr>
+        <w:ind w:left="720" w:hanging="360"/>
+      </w:pPr>
+    </w:lvl>
+    <w:lvl w:ilvl="1" w:tplc="3E36F71A" w:tentative="1">
+      <w:start w:val="1"/>
+      <w:numFmt w:val="bullet"/>
+      <w:lvlText w:val="○"/>
+      <w:lvlJc w:val="left"/>
+      <w:pPr>
+        <w:ind w:left="1440" w:hanging="360"/>
+      </w:pPr>
+    </w:lvl>
+    <w:lvl w:ilvl="2" w:tplc="26C008D2" w:tentative="1">
+      <w:start w:val="1"/>
+      <w:numFmt w:val="bullet"/>
+      <w:lvlText w:val="■"/>
+      <w:lvlJc w:val="left"/>
+      <w:pPr>
+        <w:ind w:left="2160" w:hanging="360"/>
+      </w:pPr>
+    </w:lvl>
+    <w:lvl w:ilvl="3" w:tplc="9B744558" w:tentative="1">
+      <w:start w:val="1"/>
+      <w:numFmt w:val="bullet"/>
+      <w:lvlText w:val="●"/>
+      <w:lvlJc w:val="left"/>
+      <w:pPr>
+        <w:ind w:left="2880" w:hanging="360"/>
+      </w:pPr>
+    </w:lvl>
+    <w:lvl w:ilvl="4" w:tplc="BE1A8D0C" w:tentative="1">
+      <w:start w:val="1"/>
+      <w:numFmt w:val="bullet"/>
+      <w:lvlText w:val="○"/>
+      <w:lvlJc w:val="left"/>
+      <w:pPr>
+        <w:ind w:left="3600" w:hanging="360"/>
+      </w:pPr>
+    </w:lvl>
+    <w:lvl w:ilvl="5" w:tplc="8D8EF5A0" w:tentative="1">
+      <w:start w:val="1"/>
+      <w:numFmt w:val="bullet"/>
+      <w:lvlText w:val="■"/>
+      <w:lvlJc w:val="left"/>
+      <w:pPr>
+        <w:ind w:left="4320" w:hanging="360"/>
+      </w:pPr>
+    </w:lvl>
+    <w:lvl w:ilvl="6" w:tplc="BC5234A6" w:tentative="1">
+      <w:start w:val="1"/>
+      <w:numFmt w:val="bullet"/>
+      <w:lvlText w:val="●"/>
+      <w:lvlJc w:val="left"/>
+      <w:pPr>
+        <w:ind w:left="5040" w:hanging="360"/>
+      </w:pPr>
+    </w:lvl>
+    <w:lvl w:ilvl="7" w:tplc="34CE19C4" w:tentative="1">
+      <w:start w:val="1"/>
+      <w:numFmt w:val="bullet"/>
+      <w:lvlText w:val="●"/>
+      <w:lvlJc w:val="left"/>
+      <w:pPr>
+        <w:ind w:left="5760" w:hanging="360"/>
+      </w:pPr>
+    </w:lvl>
+    <w:lvl w:ilvl="8" w:tplc="DECCE516" w:tentative="1">
+      <w:start w:val="1"/>
+      <w:numFmt w:val="bullet"/>
+      <w:lvlText w:val="●"/>
+      <w:lvlJc w:val="left"/>
+      <w:pPr>
+        <w:ind w:left="6480" w:hanging="360"/>
+      </w:pPr>
+    </w:lvl>
+  </w:abstractNum>
+  <w:abstractNum w:abstractNumId="1" w15:restartNumberingAfterBreak="0">
+    <w:nsid w:val="319E2F7A"/>
+    <w:multiLevelType w:val="hybridMultilevel"/>
+    <w:tmpl w:val="349CC2D4"/>
+    <w:lvl w:ilvl="0" w:tplc="E3468CB8">
       <w:start w:val="1"/>
       <w:numFmt w:val="bullet"/>
       <w:lvlText w:val="•"/>
@@ -10301,138 +10473,52 @@
         <w:ind w:left="540" w:hanging="270"/>
       </w:pPr>
     </w:lvl>
-    <w:lvl w:ilvl="1" w:tplc="D4D8EAE0">
+    <w:lvl w:ilvl="1" w:tplc="17A44908">
       <w:numFmt w:val="decimal"/>
       <w:lvlText w:val=""/>
       <w:lvlJc w:val="left"/>
     </w:lvl>
-    <w:lvl w:ilvl="2" w:tplc="274CF5EE">
+    <w:lvl w:ilvl="2" w:tplc="24505746">
       <w:numFmt w:val="decimal"/>
       <w:lvlText w:val=""/>
       <w:lvlJc w:val="left"/>
     </w:lvl>
-    <w:lvl w:ilvl="3" w:tplc="3A0C55CE">
+    <w:lvl w:ilvl="3" w:tplc="90463D92">
       <w:numFmt w:val="decimal"/>
       <w:lvlText w:val=""/>
       <w:lvlJc w:val="left"/>
     </w:lvl>
-    <w:lvl w:ilvl="4" w:tplc="4DD0A090">
+    <w:lvl w:ilvl="4" w:tplc="7E04EFD2">
       <w:numFmt w:val="decimal"/>
       <w:lvlText w:val=""/>
       <w:lvlJc w:val="left"/>
     </w:lvl>
-    <w:lvl w:ilvl="5" w:tplc="442EEAB0">
+    <w:lvl w:ilvl="5" w:tplc="DD64EFE6">
       <w:numFmt w:val="decimal"/>
       <w:lvlText w:val=""/>
       <w:lvlJc w:val="left"/>
     </w:lvl>
-    <w:lvl w:ilvl="6" w:tplc="F224E3E4">
+    <w:lvl w:ilvl="6" w:tplc="141E3EA2">
       <w:numFmt w:val="decimal"/>
       <w:lvlText w:val=""/>
       <w:lvlJc w:val="left"/>
     </w:lvl>
-    <w:lvl w:ilvl="7" w:tplc="34482134">
+    <w:lvl w:ilvl="7" w:tplc="5A0849A0">
       <w:numFmt w:val="decimal"/>
       <w:lvlText w:val=""/>
       <w:lvlJc w:val="left"/>
     </w:lvl>
-    <w:lvl w:ilvl="8" w:tplc="114A8880">
+    <w:lvl w:ilvl="8" w:tplc="01962AD4">
       <w:numFmt w:val="decimal"/>
       <w:lvlText w:val=""/>
       <w:lvlJc w:val="left"/>
     </w:lvl>
   </w:abstractNum>
-  <w:abstractNum w:abstractNumId="1" w15:restartNumberingAfterBreak="0">
-    <w:nsid w:val="134E3935"/>
+  <w:abstractNum w:abstractNumId="2" w15:restartNumberingAfterBreak="0">
+    <w:nsid w:val="74AA0162"/>
     <w:multiLevelType w:val="hybridMultilevel"/>
-    <w:tmpl w:val="35542290"/>
-    <w:lvl w:ilvl="0" w:tplc="6E6EDC2C" w:tentative="1">
-      <w:start w:val="1"/>
-      <w:numFmt w:val="bullet"/>
-      <w:lvlText w:val="●"/>
-      <w:lvlJc w:val="left"/>
-      <w:pPr>
-        <w:ind w:left="720" w:hanging="360"/>
-      </w:pPr>
-    </w:lvl>
-    <w:lvl w:ilvl="1" w:tplc="35AC560E" w:tentative="1">
-      <w:start w:val="1"/>
-      <w:numFmt w:val="bullet"/>
-      <w:lvlText w:val="○"/>
-      <w:lvlJc w:val="left"/>
-      <w:pPr>
-        <w:ind w:left="1440" w:hanging="360"/>
-      </w:pPr>
-    </w:lvl>
-    <w:lvl w:ilvl="2" w:tplc="B6D234A4" w:tentative="1">
-      <w:start w:val="1"/>
-      <w:numFmt w:val="bullet"/>
-      <w:lvlText w:val="■"/>
-      <w:lvlJc w:val="left"/>
-      <w:pPr>
-        <w:ind w:left="2160" w:hanging="360"/>
-      </w:pPr>
-    </w:lvl>
-    <w:lvl w:ilvl="3" w:tplc="D8EA1BD6" w:tentative="1">
-      <w:start w:val="1"/>
-      <w:numFmt w:val="bullet"/>
-      <w:lvlText w:val="●"/>
-      <w:lvlJc w:val="left"/>
-      <w:pPr>
-        <w:ind w:left="2880" w:hanging="360"/>
-      </w:pPr>
-    </w:lvl>
-    <w:lvl w:ilvl="4" w:tplc="4FE8D30C" w:tentative="1">
-      <w:start w:val="1"/>
-      <w:numFmt w:val="bullet"/>
-      <w:lvlText w:val="○"/>
-      <w:lvlJc w:val="left"/>
-      <w:pPr>
-        <w:ind w:left="3600" w:hanging="360"/>
-      </w:pPr>
-    </w:lvl>
-    <w:lvl w:ilvl="5" w:tplc="23E0C82A" w:tentative="1">
-      <w:start w:val="1"/>
-      <w:numFmt w:val="bullet"/>
-      <w:lvlText w:val="■"/>
-      <w:lvlJc w:val="left"/>
-      <w:pPr>
-        <w:ind w:left="4320" w:hanging="360"/>
-      </w:pPr>
-    </w:lvl>
-    <w:lvl w:ilvl="6" w:tplc="A2EA7A86" w:tentative="1">
-      <w:start w:val="1"/>
-      <w:numFmt w:val="bullet"/>
-      <w:lvlText w:val="●"/>
-      <w:lvlJc w:val="left"/>
-      <w:pPr>
-        <w:ind w:left="5040" w:hanging="360"/>
-      </w:pPr>
-    </w:lvl>
-    <w:lvl w:ilvl="7" w:tplc="DD3C04CC" w:tentative="1">
-      <w:start w:val="1"/>
-      <w:numFmt w:val="bullet"/>
-      <w:lvlText w:val="●"/>
-      <w:lvlJc w:val="left"/>
-      <w:pPr>
-        <w:ind w:left="5760" w:hanging="360"/>
-      </w:pPr>
-    </w:lvl>
-    <w:lvl w:ilvl="8" w:tplc="7CFC4642" w:tentative="1">
-      <w:start w:val="1"/>
-      <w:numFmt w:val="bullet"/>
-      <w:lvlText w:val="●"/>
-      <w:lvlJc w:val="left"/>
-      <w:pPr>
-        <w:ind w:left="6480" w:hanging="360"/>
-      </w:pPr>
-    </w:lvl>
-  </w:abstractNum>
-  <w:abstractNum w:abstractNumId="2" w15:restartNumberingAfterBreak="0">
-    <w:nsid w:val="146D5AE8"/>
-    <w:multiLevelType w:val="hybridMultilevel"/>
-    <w:tmpl w:val="5F7EC89E"/>
-    <w:lvl w:ilvl="0" w:tplc="F3C67AB2">
+    <w:tmpl w:val="5FA4A15E"/>
+    <w:lvl w:ilvl="0" w:tplc="FB3A7F36">
       <w:start w:val="1"/>
       <w:numFmt w:val="decimal"/>
       <w:lvlText w:val="%1."/>
@@ -10446,96 +10532,96 @@
         <w:color w:val="0F6E66"/>
       </w:rPr>
     </w:lvl>
-    <w:lvl w:ilvl="1" w:tplc="84A41C98">
+    <w:lvl w:ilvl="1" w:tplc="C6AC6148">
       <w:numFmt w:val="decimal"/>
       <w:lvlText w:val=""/>
       <w:lvlJc w:val="left"/>
     </w:lvl>
-    <w:lvl w:ilvl="2" w:tplc="5B4E2EB0">
+    <w:lvl w:ilvl="2" w:tplc="66DA4F98">
       <w:numFmt w:val="decimal"/>
       <w:lvlText w:val=""/>
       <w:lvlJc w:val="left"/>
     </w:lvl>
-    <w:lvl w:ilvl="3" w:tplc="919C968E">
+    <w:lvl w:ilvl="3" w:tplc="FCD6524A">
       <w:numFmt w:val="decimal"/>
       <w:lvlText w:val=""/>
       <w:lvlJc w:val="left"/>
     </w:lvl>
-    <w:lvl w:ilvl="4" w:tplc="49583F0A">
+    <w:lvl w:ilvl="4" w:tplc="59BE5106">
       <w:numFmt w:val="decimal"/>
       <w:lvlText w:val=""/>
       <w:lvlJc w:val="left"/>
     </w:lvl>
-    <w:lvl w:ilvl="5" w:tplc="B2145F7A">
+    <w:lvl w:ilvl="5" w:tplc="E96678D4">
       <w:numFmt w:val="decimal"/>
       <w:lvlText w:val=""/>
       <w:lvlJc w:val="left"/>
     </w:lvl>
-    <w:lvl w:ilvl="6" w:tplc="692648FE">
+    <w:lvl w:ilvl="6" w:tplc="BC5CCFAE">
       <w:numFmt w:val="decimal"/>
       <w:lvlText w:val=""/>
       <w:lvlJc w:val="left"/>
     </w:lvl>
-    <w:lvl w:ilvl="7" w:tplc="A5B6AF6C">
+    <w:lvl w:ilvl="7" w:tplc="F7DE841E">
       <w:numFmt w:val="decimal"/>
       <w:lvlText w:val=""/>
       <w:lvlJc w:val="left"/>
     </w:lvl>
-    <w:lvl w:ilvl="8" w:tplc="50761546">
+    <w:lvl w:ilvl="8" w:tplc="1AD82A76">
       <w:numFmt w:val="decimal"/>
       <w:lvlText w:val=""/>
       <w:lvlJc w:val="left"/>
     </w:lvl>
   </w:abstractNum>
-  <w:num w:numId="1" w16cid:durableId="1713309352">
+  <w:num w:numId="1" w16cid:durableId="1681002744">
+    <w:abstractNumId w:val="0"/>
+    <w:lvlOverride w:ilvl="0">
+      <w:startOverride w:val="1"/>
+    </w:lvlOverride>
+  </w:num>
+  <w:num w:numId="2" w16cid:durableId="1630166821">
+    <w:abstractNumId w:val="2"/>
+    <w:lvlOverride w:ilvl="0">
+      <w:startOverride w:val="1"/>
+    </w:lvlOverride>
+  </w:num>
+  <w:num w:numId="3" w16cid:durableId="1071847056">
+    <w:abstractNumId w:val="2"/>
+    <w:lvlOverride w:ilvl="0">
+      <w:startOverride w:val="1"/>
+    </w:lvlOverride>
+  </w:num>
+  <w:num w:numId="4" w16cid:durableId="1300645941">
+    <w:abstractNumId w:val="2"/>
+    <w:lvlOverride w:ilvl="0">
+      <w:startOverride w:val="1"/>
+    </w:lvlOverride>
+  </w:num>
+  <w:num w:numId="5" w16cid:durableId="893732517">
+    <w:abstractNumId w:val="2"/>
+    <w:lvlOverride w:ilvl="0">
+      <w:startOverride w:val="1"/>
+    </w:lvlOverride>
+  </w:num>
+  <w:num w:numId="6" w16cid:durableId="1498227279">
     <w:abstractNumId w:val="1"/>
     <w:lvlOverride w:ilvl="0">
       <w:startOverride w:val="1"/>
     </w:lvlOverride>
   </w:num>
-  <w:num w:numId="2" w16cid:durableId="1334800235">
+  <w:num w:numId="7" w16cid:durableId="1902448481">
     <w:abstractNumId w:val="2"/>
     <w:lvlOverride w:ilvl="0">
       <w:startOverride w:val="1"/>
     </w:lvlOverride>
   </w:num>
-  <w:num w:numId="3" w16cid:durableId="872035184">
+  <w:num w:numId="8" w16cid:durableId="2011325794">
     <w:abstractNumId w:val="2"/>
     <w:lvlOverride w:ilvl="0">
       <w:startOverride w:val="1"/>
     </w:lvlOverride>
   </w:num>
-  <w:num w:numId="4" w16cid:durableId="41946792">
-    <w:abstractNumId w:val="2"/>
-    <w:lvlOverride w:ilvl="0">
-      <w:startOverride w:val="1"/>
-    </w:lvlOverride>
-  </w:num>
-  <w:num w:numId="5" w16cid:durableId="796488958">
-    <w:abstractNumId w:val="2"/>
-    <w:lvlOverride w:ilvl="0">
-      <w:startOverride w:val="1"/>
-    </w:lvlOverride>
-  </w:num>
-  <w:num w:numId="6" w16cid:durableId="836842478">
-    <w:abstractNumId w:val="0"/>
-    <w:lvlOverride w:ilvl="0">
-      <w:startOverride w:val="1"/>
-    </w:lvlOverride>
-  </w:num>
-  <w:num w:numId="7" w16cid:durableId="40635130">
-    <w:abstractNumId w:val="2"/>
-    <w:lvlOverride w:ilvl="0">
-      <w:startOverride w:val="1"/>
-    </w:lvlOverride>
-  </w:num>
-  <w:num w:numId="8" w16cid:durableId="1048728505">
-    <w:abstractNumId w:val="2"/>
-    <w:lvlOverride w:ilvl="0">
-      <w:startOverride w:val="1"/>
-    </w:lvlOverride>
-  </w:num>
-  <w:num w:numId="9" w16cid:durableId="34277826">
+  <w:num w:numId="9" w16cid:durableId="1600135262">
     <w:abstractNumId w:val="2"/>
     <w:lvlOverride w:ilvl="0">
       <w:startOverride w:val="1"/>
@@ -11191,7 +11277,7 @@
     <w:autoRedefine/>
     <w:uiPriority w:val="39"/>
     <w:unhideWhenUsed/>
-    <w:rsid w:val="00B94053"/>
+    <w:rsid w:val="001F062C"/>
     <w:pPr>
       <w:spacing w:after="100"/>
     </w:pPr>
@@ -11203,7 +11289,7 @@
     <w:autoRedefine/>
     <w:uiPriority w:val="39"/>
     <w:unhideWhenUsed/>
-    <w:rsid w:val="00B94053"/>
+    <w:rsid w:val="001F062C"/>
     <w:pPr>
       <w:spacing w:after="100"/>
       <w:ind w:left="210"/>

</xml_diff>